<commit_message>
Add catchment-area plausibility check for the corrected discharge; update readiness assessment
Co-Authored-By: Claude Sonnet 5.5 <noreply@anthropic.com>
Claude-Session: https://claude.ai/code/session_01UNAiKHbEtvMv98uPLPeASA
</commit_message>
<xml_diff>
--- a/paper/corrected/PAPER.docx
+++ b/paper/corrected/PAPER.docx
@@ -266,7 +266,7 @@
         <w:t xml:space="preserve"> </w:t>
       </w:r>
       <w:r>
-        <w:t xml:space="preserve">The target remains modelled and partly circular with the weather inputs, the record covers about 4.7 monsoons, and neither the corrected cells nor the model skill have been validated against gauge data. We argue that the main contributions are the audited and corrected panel, a leakage-tested benchmark in which model complexity buys little over persistence, and an explicit account of what daily modelled data cannot show.</w:t>
+        <w:t xml:space="preserve">The target remains modelled and partly circular with the weather inputs, the record covers about 4.7 monsoons, and neither the corrected cells nor the model skill have been validated against gauge data (the corrections passed only internal plausibility checks, such as the catchment area implied by the mean flow). We argue that the main contributions are the audited and corrected panel, a leakage-tested benchmark in which model complexity buys little over persistence, and an explicit account of what daily modelled data cannot show.</w:t>
       </w:r>
     </w:p>
     <w:p>
@@ -318,7 +318,7 @@
         <w:pStyle w:val="FirstParagraph"/>
       </w:pPr>
       <w:r>
-        <w:t xml:space="preserve">Nepal is a small country that drains a very large mountain range. Its rivers rise in or beyond the High Himalaya, fall several thousand metres in a few hundred kilometres, and leave the country into the Indo-Gangetic plain, where they join the Ganges system. The Koshi, Gandak (known as the Narayani inside Nepal), Karnali and Mahakali systems, together with the smaller Bagmati, Kamala and Rapti, carry the bulk of monsoon runoff. Between June and September, the South Asian monsoon delivers most of the year’s precipitation to these catchments. In the ten-location panel analysed here, between 62 % and 89 % of precipitation falls in June–September, depending on the location (Table 4).</w:t>
+        <w:t xml:space="preserve">Nepal is a small country that drains a very large mountain range. Its rivers rise in or beyond the High Himalaya, fall several thousand metres in a few hundred kilometres, and leave the country into the Indo-Gangetic plain, where they join the Ganges system. The Koshi, Gandak (known as the Narayani inside Nepal), Karnali and Mahakali systems, together with the smaller Bagmati, Kamala and Rapti, carry the bulk of monsoon runoff. Between June and September, the South Asian monsoon delivers most of the year’s precipitation to these catchments. In the ten-location panel analysed here, between 62 % and 89 % of precipitation falls in June–September, depending on the location (Table 5).</w:t>
       </w:r>
     </w:p>
     <w:p>
@@ -4781,16 +4781,225 @@
       </w:pPr>
       <w:r>
         <w:rPr>
-          <w:b/>
-          <w:bCs/>
+          <w:i/>
+          <w:iCs/>
         </w:rPr>
-        <w:t xml:space="preserve">A5 — Quantisation and repeated values (consequence of A4).</w:t>
-      </w:r>
-      <w:r>
-        <w:t xml:space="preserve"> </w:t>
-      </w:r>
-      <w:r>
-        <w:t xml:space="preserve">In the V2 series, 64 % of Bhada Bridge days and 51 % of Chisapani days had discharge identical to the previous day, because flows were so small that they were rounded at the second decimal. In the corrected series the repeated-value fraction is 2–13 % at every location (Table 5).</w:t>
+        <w:t xml:space="preserve">A plausibility check that needs no gauge data.</w:t>
+      </w:r>
+      <w:r>
+        <w:t xml:space="preserve"> </w:t>
+      </w:r>
+      <w:r>
+        <w:t xml:space="preserve">A river’s mean flow cannot exceed the water that falls on its catchment, so mean discharge</w:t>
+      </w:r>
+      <w:r>
+        <w:t xml:space="preserve"> </w:t>
+      </w:r>
+      <m:oMath>
+        <m:acc>
+          <m:accPr>
+            <m:chr m:val="‾"/>
+          </m:accPr>
+          <m:e>
+            <m:r>
+              <m:t>Q</m:t>
+            </m:r>
+          </m:e>
+        </m:acc>
+      </m:oMath>
+      <w:r>
+        <w:t xml:space="preserve">, mean annual precipitation</w:t>
+      </w:r>
+      <w:r>
+        <w:t xml:space="preserve"> </w:t>
+      </w:r>
+      <m:oMath>
+        <m:acc>
+          <m:accPr>
+            <m:chr m:val="‾"/>
+          </m:accPr>
+          <m:e>
+            <m:r>
+              <m:t>P</m:t>
+            </m:r>
+          </m:e>
+        </m:acc>
+      </m:oMath>
+      <w:r>
+        <w:t xml:space="preserve"> </w:t>
+      </w:r>
+      <w:r>
+        <w:t xml:space="preserve">at the coordinate and a runoff coefficient</w:t>
+      </w:r>
+      <w:r>
+        <w:t xml:space="preserve"> </w:t>
+      </w:r>
+      <m:oMath>
+        <m:r>
+          <m:t>c</m:t>
+        </m:r>
+      </m:oMath>
+      <w:r>
+        <w:t xml:space="preserve"> </w:t>
+      </w:r>
+      <w:r>
+        <w:t xml:space="preserve">imply a catchment area</w:t>
+      </w:r>
+      <w:r>
+        <w:t xml:space="preserve"> </w:t>
+      </w:r>
+      <m:oMath>
+        <m:r>
+          <m:t>A</m:t>
+        </m:r>
+        <m:r>
+          <m:rPr>
+            <m:sty m:val="p"/>
+          </m:rPr>
+          <m:t>=</m:t>
+        </m:r>
+        <m:acc>
+          <m:accPr>
+            <m:chr m:val="‾"/>
+          </m:accPr>
+          <m:e>
+            <m:r>
+              <m:t>Q</m:t>
+            </m:r>
+          </m:e>
+        </m:acc>
+        <m:r>
+          <m:rPr>
+            <m:sty m:val="p"/>
+          </m:rPr>
+          <m:t>⋅</m:t>
+        </m:r>
+        <m:r>
+          <m:rPr>
+            <m:sty m:val="p"/>
+          </m:rPr>
+          <m:t>(</m:t>
+        </m:r>
+        <m:r>
+          <m:t>3.156</m:t>
+        </m:r>
+        <m:r>
+          <m:rPr>
+            <m:sty m:val="p"/>
+          </m:rPr>
+          <m:t>×</m:t>
+        </m:r>
+        <m:sSup>
+          <m:e>
+            <m:r>
+              <m:t>10</m:t>
+            </m:r>
+          </m:e>
+          <m:sup>
+            <m:r>
+              <m:t>7</m:t>
+            </m:r>
+          </m:sup>
+        </m:sSup>
+        <m:r>
+          <m:t> </m:t>
+        </m:r>
+        <m:r>
+          <m:rPr>
+            <m:sty m:val="p"/>
+          </m:rPr>
+          <m:t>s</m:t>
+        </m:r>
+        <m:r>
+          <m:rPr>
+            <m:sty m:val="p"/>
+          </m:rPr>
+          <m:t>)</m:t>
+        </m:r>
+        <m:r>
+          <m:rPr>
+            <m:sty m:val="p"/>
+          </m:rPr>
+          <m:t>/</m:t>
+        </m:r>
+        <m:r>
+          <m:rPr>
+            <m:sty m:val="p"/>
+          </m:rPr>
+          <m:t>(</m:t>
+        </m:r>
+        <m:acc>
+          <m:accPr>
+            <m:chr m:val="‾"/>
+          </m:accPr>
+          <m:e>
+            <m:r>
+              <m:t>P</m:t>
+            </m:r>
+          </m:e>
+        </m:acc>
+        <m:r>
+          <m:t> </m:t>
+        </m:r>
+        <m:r>
+          <m:t>c</m:t>
+        </m:r>
+        <m:r>
+          <m:rPr>
+            <m:sty m:val="p"/>
+          </m:rPr>
+          <m:t>)</m:t>
+        </m:r>
+      </m:oMath>
+      <w:r>
+        <w:t xml:space="preserve">. With</w:t>
+      </w:r>
+      <w:r>
+        <w:t xml:space="preserve"> </w:t>
+      </w:r>
+      <m:oMath>
+        <m:r>
+          <m:t>c</m:t>
+        </m:r>
+        <m:r>
+          <m:rPr>
+            <m:sty m:val="p"/>
+          </m:rPr>
+          <m:t>=</m:t>
+        </m:r>
+        <m:r>
+          <m:t>0.5</m:t>
+        </m:r>
+      </m:oMath>
+      <w:r>
+        <w:t xml:space="preserve"> </w:t>
+      </w:r>
+      <w:r>
+        <w:t xml:space="preserve">(range 0.3–0.7), the V2 series imply catchments of only 31 km² for the Karnali at Chisapani, 59 km² for the Saptakoshi at Chatara and 107 km² for the Narayani at Devghat, which is impossible for rivers that drain tens of thousands of square kilometres (Table 4). The corrected series imply about 48,000, 73,000 and 74,000 km², the right order of magnitude; they are, if anything, larger than we would expect for these basins (by a factor of roughly 1–2, which the unrepresentative point precipitation, snow and groundwater contributions and the choice of</w:t>
+      </w:r>
+      <w:r>
+        <w:t xml:space="preserve"> </w:t>
+      </w:r>
+      <m:oMath>
+        <m:r>
+          <m:t>c</m:t>
+        </m:r>
+      </m:oMath>
+      <w:r>
+        <w:t xml:space="preserve"> </w:t>
+      </w:r>
+      <w:r>
+        <w:t xml:space="preserve">can easily account for). The check is weak (it fixes the order of magnitude, not the value) and it also flags two corrected cells: Rasuwagadhi implies about 5,500 km², more than we would expect for the Bhote Koshi at the border crossing, so its replacement cell may lie downstream on the Trishuli, and Khokana implies about 1,250 km², larger than we would expect for the Bagmati at Khokana. The nesting is consistent: the corrected mean flow at Rasuwagadhi (133 m³/s) is far below that at Devghat (1,609 m³/s), which it feeds, and Bahrabise (84 m³/s) is far below Chatara (1,829 m³/s).</w:t>
+      </w:r>
+      <w:r>
+        <w:t xml:space="preserve"> </w:t>
+      </w:r>
+      <w:r>
+        <w:rPr>
+          <w:i/>
+          <w:iCs/>
+        </w:rPr>
+        <w:t xml:space="preserve">We therefore regard the three large-river corrections as plausible, Bhada Bridge and Bahrabise as plausible, and Khokana and Rasuwagadhi as uncertain; none is validated against gauges.</w:t>
       </w:r>
     </w:p>
     <w:p>
@@ -4802,131 +5011,13 @@
           <w:b/>
           <w:bCs/>
         </w:rPr>
-        <w:t xml:space="preserve">A6 — Intermittent zero flow (consequence of A4).</w:t>
-      </w:r>
-      <w:r>
-        <w:t xml:space="preserve"> </w:t>
-      </w:r>
-      <w:r>
-        <w:t xml:space="preserve">The V2 series had 223 days of exactly zero discharge at Khokana (16.7 % of the record). The corrected series has none (its 5th percentile is 0.1 m³/s), so the apparent intermittency was an artefact of the small cell and no zero-flow model is needed.</w:t>
-      </w:r>
-    </w:p>
-    <w:p>
-      <w:pPr>
-        <w:pStyle w:val="BodyText"/>
-      </w:pPr>
-      <w:r>
-        <w:rPr>
-          <w:b/>
-          <w:bCs/>
-        </w:rPr>
-        <w:t xml:space="preserve">A7 — Elevation field plausibility.</w:t>
-      </w:r>
-      <w:r>
-        <w:t xml:space="preserve"> </w:t>
-      </w:r>
-      <w:r>
-        <w:t xml:space="preserve">The</w:t>
-      </w:r>
-      <w:r>
-        <w:t xml:space="preserve"> </w:t>
-      </w:r>
-      <w:r>
-        <w:rPr>
-          <w:rStyle w:val="VerbatimChar"/>
-        </w:rPr>
-        <w:t xml:space="preserve">elevation_m</w:t>
-      </w:r>
-      <w:r>
-        <w:t xml:space="preserve"> </w:t>
-      </w:r>
-      <w:r>
-        <w:t xml:space="preserve">field gives Chisapani as 2,215 m, but its mean temperature is 23.1 °C, similar to the 150–230 m sites (23.9–24.6 °C) and far above the 17.5 °C of the 1,749 m Rasuwagadhi site. A 2,215 m Nepal site with a 23 °C annual mean is not plausible. We therefore</w:t>
-      </w:r>
-      <w:r>
-        <w:t xml:space="preserve"> </w:t>
-      </w:r>
-      <w:r>
-        <w:rPr>
-          <w:b/>
-          <w:bCs/>
-        </w:rPr>
-        <w:t xml:space="preserve">do not treat</w:t>
-      </w:r>
-      <w:r>
-        <w:rPr>
-          <w:b/>
-          <w:bCs/>
-        </w:rPr>
-        <w:t xml:space="preserve"> </w:t>
-      </w:r>
-      <w:r>
-        <w:rPr>
-          <w:rStyle w:val="VerbatimChar"/>
-          <w:b/>
-          <w:bCs/>
-        </w:rPr>
-        <w:t xml:space="preserve">elevation_m</w:t>
-      </w:r>
-      <w:r>
-        <w:rPr>
-          <w:b/>
-          <w:bCs/>
-        </w:rPr>
-        <w:t xml:space="preserve"> </w:t>
-      </w:r>
-      <w:r>
-        <w:rPr>
-          <w:b/>
-          <w:bCs/>
-        </w:rPr>
-        <w:t xml:space="preserve">as a physical covariate</w:t>
-      </w:r>
-      <w:r>
-        <w:t xml:space="preserve"> </w:t>
-      </w:r>
-      <w:r>
-        <w:t xml:space="preserve">and run models with and without it.</w:t>
-      </w:r>
-      <w:r>
-        <w:t xml:space="preserve"> </w:t>
-      </w:r>
-      <w:r>
-        <w:rPr>
-          <w:i/>
-          <w:iCs/>
-        </w:rPr>
-        <w:t xml:space="preserve">Fail, unresolved.</w:t>
-      </w:r>
-    </w:p>
-    <w:p>
-      <w:pPr>
-        <w:pStyle w:val="BodyText"/>
-      </w:pPr>
-      <w:r>
-        <w:rPr>
-          <w:b/>
-          <w:bCs/>
-        </w:rPr>
-        <w:t xml:space="preserve">A8 — Dates beyond the present.</w:t>
-      </w:r>
-      <w:r>
-        <w:t xml:space="preserve"> </w:t>
-      </w:r>
-      <w:r>
-        <w:t xml:space="preserve">The panel ends on 31 August 2026 and contains the 2026 monsoon through that date. The documentation mentions a 2026 flood in the Rasuwa and Bhote Koshi–Trishuli corridor without giving its date, so it cannot be tested directly (Section 8.8).</w:t>
-      </w:r>
-    </w:p>
-    <w:p>
-      <w:pPr>
-        <w:pStyle w:val="BodyText"/>
-      </w:pPr>
-      <w:r>
-        <w:rPr>
-          <w:b/>
-          <w:bCs/>
-        </w:rPr>
-        <w:t xml:space="preserve">Table 4. Seasonality and tail diagnostics per location (June–September = monsoon), corrected discharge.</w:t>
+        <w:t xml:space="preserve">Table 4. Catchment area implied by mean discharge, local precipitation and a runoff coefficient of 0.5.</w:t>
+      </w:r>
+      <w:r>
+        <w:t xml:space="preserve"> </w:t>
+      </w:r>
+      <w:r>
+        <w:t xml:space="preserve">The V2 areas for the three large rivers are physically impossible; the corrected areas have the right order of magnitude. Areas for the smaller rivers are indicative only.</w:t>
       </w:r>
     </w:p>
     <w:tbl>
@@ -4956,73 +5047,73 @@
               <w:pStyle w:val="Compact"/>
             </w:pPr>
             <w:r>
-              <w:t xml:space="preserve">location</w:t>
-            </w:r>
-          </w:p>
-        </w:tc>
-        <w:tc>
-          <w:tcPr/>
-          <w:p>
-            <w:pPr>
-              <w:pStyle w:val="Compact"/>
-            </w:pPr>
-            <w:r>
-              <w:t xml:space="preserve">Monsoon (JJAS) share of P</w:t>
-            </w:r>
-          </w:p>
-        </w:tc>
-        <w:tc>
-          <w:tcPr/>
-          <w:p>
-            <w:pPr>
-              <w:pStyle w:val="Compact"/>
-            </w:pPr>
-            <w:r>
-              <w:t xml:space="preserve">Monsoon share of Q</w:t>
-            </w:r>
-          </w:p>
-        </w:tc>
-        <w:tc>
-          <w:tcPr/>
-          <w:p>
-            <w:pPr>
-              <w:pStyle w:val="Compact"/>
-            </w:pPr>
-            <w:r>
-              <w:t xml:space="preserve">CV of Q</w:t>
-            </w:r>
-          </w:p>
-        </w:tc>
-        <w:tc>
-          <w:tcPr/>
-          <w:p>
-            <w:pPr>
-              <w:pStyle w:val="Compact"/>
-            </w:pPr>
-            <w:r>
-              <w:t xml:space="preserve">Q99 / median</w:t>
-            </w:r>
-          </w:p>
-        </w:tc>
-        <w:tc>
-          <w:tcPr/>
-          <w:p>
-            <w:pPr>
-              <w:pStyle w:val="Compact"/>
-            </w:pPr>
-            <w:r>
-              <w:t xml:space="preserve">P99 (mm/d)</w:t>
-            </w:r>
-          </w:p>
-        </w:tc>
-        <w:tc>
-          <w:tcPr/>
-          <w:p>
-            <w:pPr>
-              <w:pStyle w:val="Compact"/>
-            </w:pPr>
-            <w:r>
-              <w:t xml:space="preserve">Zero-Q days</w:t>
+              <w:t xml:space="preserve">Location</w:t>
+            </w:r>
+          </w:p>
+        </w:tc>
+        <w:tc>
+          <w:tcPr/>
+          <w:p>
+            <w:pPr>
+              <w:pStyle w:val="Compact"/>
+            </w:pPr>
+            <w:r>
+              <w:t xml:space="preserve">Annual precipitation at coordinate (mm)</w:t>
+            </w:r>
+          </w:p>
+        </w:tc>
+        <w:tc>
+          <w:tcPr/>
+          <w:p>
+            <w:pPr>
+              <w:pStyle w:val="Compact"/>
+            </w:pPr>
+            <w:r>
+              <w:t xml:space="preserve">V2 mean Q (m³/s)</w:t>
+            </w:r>
+          </w:p>
+        </w:tc>
+        <w:tc>
+          <w:tcPr/>
+          <w:p>
+            <w:pPr>
+              <w:pStyle w:val="Compact"/>
+            </w:pPr>
+            <w:r>
+              <w:t xml:space="preserve">V2 implied area (km²)</w:t>
+            </w:r>
+          </w:p>
+        </w:tc>
+        <w:tc>
+          <w:tcPr/>
+          <w:p>
+            <w:pPr>
+              <w:pStyle w:val="Compact"/>
+            </w:pPr>
+            <w:r>
+              <w:t xml:space="preserve">Corrected mean Q (m³/s)</w:t>
+            </w:r>
+          </w:p>
+        </w:tc>
+        <w:tc>
+          <w:tcPr/>
+          <w:p>
+            <w:pPr>
+              <w:pStyle w:val="Compact"/>
+            </w:pPr>
+            <w:r>
+              <w:t xml:space="preserve">Corrected implied area (km²)</w:t>
+            </w:r>
+          </w:p>
+        </w:tc>
+        <w:tc>
+          <w:tcPr/>
+          <w:p>
+            <w:pPr>
+              <w:pStyle w:val="Compact"/>
+            </w:pPr>
+            <w:r>
+              <w:t xml:space="preserve">Range for c = 0.7–0.3 (km²)</w:t>
             </w:r>
           </w:p>
         </w:tc>
@@ -5035,73 +5126,73 @@
               <w:pStyle w:val="Compact"/>
             </w:pPr>
             <w:r>
-              <w:t xml:space="preserve">Chatara</w:t>
-            </w:r>
-          </w:p>
-        </w:tc>
-        <w:tc>
-          <w:tcPr/>
-          <w:p>
-            <w:pPr>
-              <w:pStyle w:val="Compact"/>
-            </w:pPr>
-            <w:r>
-              <w:t xml:space="preserve">77%</w:t>
-            </w:r>
-          </w:p>
-        </w:tc>
-        <w:tc>
-          <w:tcPr/>
-          <w:p>
-            <w:pPr>
-              <w:pStyle w:val="Compact"/>
-            </w:pPr>
-            <w:r>
-              <w:t xml:space="preserve">70%</w:t>
-            </w:r>
-          </w:p>
-        </w:tc>
-        <w:tc>
-          <w:tcPr/>
-          <w:p>
-            <w:pPr>
-              <w:pStyle w:val="Compact"/>
-            </w:pPr>
-            <w:r>
-              <w:t xml:space="preserve">0.94</w:t>
-            </w:r>
-          </w:p>
-        </w:tc>
-        <w:tc>
-          <w:tcPr/>
-          <w:p>
-            <w:pPr>
-              <w:pStyle w:val="Compact"/>
-            </w:pPr>
-            <w:r>
-              <w:t xml:space="preserve">7.5</w:t>
-            </w:r>
-          </w:p>
-        </w:tc>
-        <w:tc>
-          <w:tcPr/>
-          <w:p>
-            <w:pPr>
-              <w:pStyle w:val="Compact"/>
-            </w:pPr>
-            <w:r>
-              <w:t xml:space="preserve">51.4</w:t>
-            </w:r>
-          </w:p>
-        </w:tc>
-        <w:tc>
-          <w:tcPr/>
-          <w:p>
-            <w:pPr>
-              <w:pStyle w:val="Compact"/>
-            </w:pPr>
-            <w:r>
-              <w:t xml:space="preserve">0.0%</w:t>
+              <w:t xml:space="preserve">Devghat</w:t>
+            </w:r>
+          </w:p>
+        </w:tc>
+        <w:tc>
+          <w:tcPr/>
+          <w:p>
+            <w:pPr>
+              <w:pStyle w:val="Compact"/>
+            </w:pPr>
+            <w:r>
+              <w:t xml:space="preserve">1,373</w:t>
+            </w:r>
+          </w:p>
+        </w:tc>
+        <w:tc>
+          <w:tcPr/>
+          <w:p>
+            <w:pPr>
+              <w:pStyle w:val="Compact"/>
+            </w:pPr>
+            <w:r>
+              <w:t xml:space="preserve">2</w:t>
+            </w:r>
+          </w:p>
+        </w:tc>
+        <w:tc>
+          <w:tcPr/>
+          <w:p>
+            <w:pPr>
+              <w:pStyle w:val="Compact"/>
+            </w:pPr>
+            <w:r>
+              <w:t xml:space="preserve">107</w:t>
+            </w:r>
+          </w:p>
+        </w:tc>
+        <w:tc>
+          <w:tcPr/>
+          <w:p>
+            <w:pPr>
+              <w:pStyle w:val="Compact"/>
+            </w:pPr>
+            <w:r>
+              <w:t xml:space="preserve">1,609</w:t>
+            </w:r>
+          </w:p>
+        </w:tc>
+        <w:tc>
+          <w:tcPr/>
+          <w:p>
+            <w:pPr>
+              <w:pStyle w:val="Compact"/>
+            </w:pPr>
+            <w:r>
+              <w:t xml:space="preserve">73,972</w:t>
+            </w:r>
+          </w:p>
+        </w:tc>
+        <w:tc>
+          <w:tcPr/>
+          <w:p>
+            <w:pPr>
+              <w:pStyle w:val="Compact"/>
+            </w:pPr>
+            <w:r>
+              <w:t xml:space="preserve">52,837–123,286</w:t>
             </w:r>
           </w:p>
         </w:tc>
@@ -5114,73 +5205,73 @@
               <w:pStyle w:val="Compact"/>
             </w:pPr>
             <w:r>
-              <w:t xml:space="preserve">Bhada Bridge</w:t>
-            </w:r>
-          </w:p>
-        </w:tc>
-        <w:tc>
-          <w:tcPr/>
-          <w:p>
-            <w:pPr>
-              <w:pStyle w:val="Compact"/>
-            </w:pPr>
-            <w:r>
-              <w:t xml:space="preserve">89%</w:t>
-            </w:r>
-          </w:p>
-        </w:tc>
-        <w:tc>
-          <w:tcPr/>
-          <w:p>
-            <w:pPr>
-              <w:pStyle w:val="Compact"/>
-            </w:pPr>
-            <w:r>
-              <w:t xml:space="preserve">85%</w:t>
-            </w:r>
-          </w:p>
-        </w:tc>
-        <w:tc>
-          <w:tcPr/>
-          <w:p>
-            <w:pPr>
-              <w:pStyle w:val="Compact"/>
-            </w:pPr>
-            <w:r>
-              <w:t xml:space="preserve">1.89</w:t>
-            </w:r>
-          </w:p>
-        </w:tc>
-        <w:tc>
-          <w:tcPr/>
-          <w:p>
-            <w:pPr>
-              <w:pStyle w:val="Compact"/>
-            </w:pPr>
-            <w:r>
-              <w:t xml:space="preserve">71.5</w:t>
-            </w:r>
-          </w:p>
-        </w:tc>
-        <w:tc>
-          <w:tcPr/>
-          <w:p>
-            <w:pPr>
-              <w:pStyle w:val="Compact"/>
-            </w:pPr>
-            <w:r>
-              <w:t xml:space="preserve">40.5</w:t>
-            </w:r>
-          </w:p>
-        </w:tc>
-        <w:tc>
-          <w:tcPr/>
-          <w:p>
-            <w:pPr>
-              <w:pStyle w:val="Compact"/>
-            </w:pPr>
-            <w:r>
-              <w:t xml:space="preserve">0.0%</w:t>
+              <w:t xml:space="preserve">Chatara</w:t>
+            </w:r>
+          </w:p>
+        </w:tc>
+        <w:tc>
+          <w:tcPr/>
+          <w:p>
+            <w:pPr>
+              <w:pStyle w:val="Compact"/>
+            </w:pPr>
+            <w:r>
+              <w:t xml:space="preserve">1,583</w:t>
+            </w:r>
+          </w:p>
+        </w:tc>
+        <w:tc>
+          <w:tcPr/>
+          <w:p>
+            <w:pPr>
+              <w:pStyle w:val="Compact"/>
+            </w:pPr>
+            <w:r>
+              <w:t xml:space="preserve">2</w:t>
+            </w:r>
+          </w:p>
+        </w:tc>
+        <w:tc>
+          <w:tcPr/>
+          <w:p>
+            <w:pPr>
+              <w:pStyle w:val="Compact"/>
+            </w:pPr>
+            <w:r>
+              <w:t xml:space="preserve">59</w:t>
+            </w:r>
+          </w:p>
+        </w:tc>
+        <w:tc>
+          <w:tcPr/>
+          <w:p>
+            <w:pPr>
+              <w:pStyle w:val="Compact"/>
+            </w:pPr>
+            <w:r>
+              <w:t xml:space="preserve">1,829</w:t>
+            </w:r>
+          </w:p>
+        </w:tc>
+        <w:tc>
+          <w:tcPr/>
+          <w:p>
+            <w:pPr>
+              <w:pStyle w:val="Compact"/>
+            </w:pPr>
+            <w:r>
+              <w:t xml:space="preserve">72,909</w:t>
+            </w:r>
+          </w:p>
+        </w:tc>
+        <w:tc>
+          <w:tcPr/>
+          <w:p>
+            <w:pPr>
+              <w:pStyle w:val="Compact"/>
+            </w:pPr>
+            <w:r>
+              <w:t xml:space="preserve">52,078–121,516</w:t>
             </w:r>
           </w:p>
         </w:tc>
@@ -5193,73 +5284,73 @@
               <w:pStyle w:val="Compact"/>
             </w:pPr>
             <w:r>
-              <w:t xml:space="preserve">Belsot</w:t>
-            </w:r>
-          </w:p>
-        </w:tc>
-        <w:tc>
-          <w:tcPr/>
-          <w:p>
-            <w:pPr>
-              <w:pStyle w:val="Compact"/>
-            </w:pPr>
-            <w:r>
-              <w:t xml:space="preserve">73%</w:t>
-            </w:r>
-          </w:p>
-        </w:tc>
-        <w:tc>
-          <w:tcPr/>
-          <w:p>
-            <w:pPr>
-              <w:pStyle w:val="Compact"/>
-            </w:pPr>
-            <w:r>
-              <w:t xml:space="preserve">63%</w:t>
-            </w:r>
-          </w:p>
-        </w:tc>
-        <w:tc>
-          <w:tcPr/>
-          <w:p>
-            <w:pPr>
-              <w:pStyle w:val="Compact"/>
-            </w:pPr>
-            <w:r>
-              <w:t xml:space="preserve">1.18</w:t>
-            </w:r>
-          </w:p>
-        </w:tc>
-        <w:tc>
-          <w:tcPr/>
-          <w:p>
-            <w:pPr>
-              <w:pStyle w:val="Compact"/>
-            </w:pPr>
-            <w:r>
-              <w:t xml:space="preserve">15.6</w:t>
-            </w:r>
-          </w:p>
-        </w:tc>
-        <w:tc>
-          <w:tcPr/>
-          <w:p>
-            <w:pPr>
-              <w:pStyle w:val="Compact"/>
-            </w:pPr>
-            <w:r>
-              <w:t xml:space="preserve">46.7</w:t>
-            </w:r>
-          </w:p>
-        </w:tc>
-        <w:tc>
-          <w:tcPr/>
-          <w:p>
-            <w:pPr>
-              <w:pStyle w:val="Compact"/>
-            </w:pPr>
-            <w:r>
-              <w:t xml:space="preserve">0.0%</w:t>
+              <w:t xml:space="preserve">Chisapani</w:t>
+            </w:r>
+          </w:p>
+        </w:tc>
+        <w:tc>
+          <w:tcPr/>
+          <w:p>
+            <w:pPr>
+              <w:pStyle w:val="Compact"/>
+            </w:pPr>
+            <w:r>
+              <w:t xml:space="preserve">1,746</w:t>
+            </w:r>
+          </w:p>
+        </w:tc>
+        <w:tc>
+          <w:tcPr/>
+          <w:p>
+            <w:pPr>
+              <w:pStyle w:val="Compact"/>
+            </w:pPr>
+            <w:r>
+              <w:t xml:space="preserve">1</w:t>
+            </w:r>
+          </w:p>
+        </w:tc>
+        <w:tc>
+          <w:tcPr/>
+          <w:p>
+            <w:pPr>
+              <w:pStyle w:val="Compact"/>
+            </w:pPr>
+            <w:r>
+              <w:t xml:space="preserve">31</w:t>
+            </w:r>
+          </w:p>
+        </w:tc>
+        <w:tc>
+          <w:tcPr/>
+          <w:p>
+            <w:pPr>
+              <w:pStyle w:val="Compact"/>
+            </w:pPr>
+            <w:r>
+              <w:t xml:space="preserve">1,325</w:t>
+            </w:r>
+          </w:p>
+        </w:tc>
+        <w:tc>
+          <w:tcPr/>
+          <w:p>
+            <w:pPr>
+              <w:pStyle w:val="Compact"/>
+            </w:pPr>
+            <w:r>
+              <w:t xml:space="preserve">47,905</w:t>
+            </w:r>
+          </w:p>
+        </w:tc>
+        <w:tc>
+          <w:tcPr/>
+          <w:p>
+            <w:pPr>
+              <w:pStyle w:val="Compact"/>
+            </w:pPr>
+            <w:r>
+              <w:t xml:space="preserve">34,218–79,842</w:t>
             </w:r>
           </w:p>
         </w:tc>
@@ -5283,62 +5374,62 @@
               <w:pStyle w:val="Compact"/>
             </w:pPr>
             <w:r>
-              <w:t xml:space="preserve">85%</w:t>
-            </w:r>
-          </w:p>
-        </w:tc>
-        <w:tc>
-          <w:tcPr/>
-          <w:p>
-            <w:pPr>
-              <w:pStyle w:val="Compact"/>
-            </w:pPr>
-            <w:r>
-              <w:t xml:space="preserve">85%</w:t>
-            </w:r>
-          </w:p>
-        </w:tc>
-        <w:tc>
-          <w:tcPr/>
-          <w:p>
-            <w:pPr>
-              <w:pStyle w:val="Compact"/>
-            </w:pPr>
-            <w:r>
-              <w:t xml:space="preserve">1.86</w:t>
-            </w:r>
-          </w:p>
-        </w:tc>
-        <w:tc>
-          <w:tcPr/>
-          <w:p>
-            <w:pPr>
-              <w:pStyle w:val="Compact"/>
-            </w:pPr>
-            <w:r>
-              <w:t xml:space="preserve">56.9</w:t>
-            </w:r>
-          </w:p>
-        </w:tc>
-        <w:tc>
-          <w:tcPr/>
-          <w:p>
-            <w:pPr>
-              <w:pStyle w:val="Compact"/>
-            </w:pPr>
-            <w:r>
-              <w:t xml:space="preserve">29.4</w:t>
-            </w:r>
-          </w:p>
-        </w:tc>
-        <w:tc>
-          <w:tcPr/>
-          <w:p>
-            <w:pPr>
-              <w:pStyle w:val="Compact"/>
-            </w:pPr>
-            <w:r>
-              <w:t xml:space="preserve">0.0%</w:t>
+              <w:t xml:space="preserve">1,122</w:t>
+            </w:r>
+          </w:p>
+        </w:tc>
+        <w:tc>
+          <w:tcPr/>
+          <w:p>
+            <w:pPr>
+              <w:pStyle w:val="Compact"/>
+            </w:pPr>
+            <w:r>
+              <w:t xml:space="preserve">126</w:t>
+            </w:r>
+          </w:p>
+        </w:tc>
+        <w:tc>
+          <w:tcPr/>
+          <w:p>
+            <w:pPr>
+              <w:pStyle w:val="Compact"/>
+            </w:pPr>
+            <w:r>
+              <w:t xml:space="preserve">7,075</w:t>
+            </w:r>
+          </w:p>
+        </w:tc>
+        <w:tc>
+          <w:tcPr/>
+          <w:p>
+            <w:pPr>
+              <w:pStyle w:val="Compact"/>
+            </w:pPr>
+            <w:r>
+              <w:t xml:space="preserve">126</w:t>
+            </w:r>
+          </w:p>
+        </w:tc>
+        <w:tc>
+          <w:tcPr/>
+          <w:p>
+            <w:pPr>
+              <w:pStyle w:val="Compact"/>
+            </w:pPr>
+            <w:r>
+              <w:t xml:space="preserve">7,075</w:t>
+            </w:r>
+          </w:p>
+        </w:tc>
+        <w:tc>
+          <w:tcPr/>
+          <w:p>
+            <w:pPr>
+              <w:pStyle w:val="Compact"/>
+            </w:pPr>
+            <w:r>
+              <w:t xml:space="preserve">5,054–11,792</w:t>
             </w:r>
           </w:p>
         </w:tc>
@@ -5351,73 +5442,73 @@
               <w:pStyle w:val="Compact"/>
             </w:pPr>
             <w:r>
-              <w:t xml:space="preserve">Devghat</w:t>
-            </w:r>
-          </w:p>
-        </w:tc>
-        <w:tc>
-          <w:tcPr/>
-          <w:p>
-            <w:pPr>
-              <w:pStyle w:val="Compact"/>
-            </w:pPr>
-            <w:r>
-              <w:t xml:space="preserve">79%</w:t>
-            </w:r>
-          </w:p>
-        </w:tc>
-        <w:tc>
-          <w:tcPr/>
-          <w:p>
-            <w:pPr>
-              <w:pStyle w:val="Compact"/>
-            </w:pPr>
-            <w:r>
-              <w:t xml:space="preserve">76%</w:t>
-            </w:r>
-          </w:p>
-        </w:tc>
-        <w:tc>
-          <w:tcPr/>
-          <w:p>
-            <w:pPr>
-              <w:pStyle w:val="Compact"/>
-            </w:pPr>
-            <w:r>
-              <w:t xml:space="preserve">1.12</w:t>
-            </w:r>
-          </w:p>
-        </w:tc>
-        <w:tc>
-          <w:tcPr/>
-          <w:p>
-            <w:pPr>
-              <w:pStyle w:val="Compact"/>
-            </w:pPr>
-            <w:r>
-              <w:t xml:space="preserve">10.5</w:t>
-            </w:r>
-          </w:p>
-        </w:tc>
-        <w:tc>
-          <w:tcPr/>
-          <w:p>
-            <w:pPr>
-              <w:pStyle w:val="Compact"/>
-            </w:pPr>
-            <w:r>
-              <w:t xml:space="preserve">48.2</w:t>
-            </w:r>
-          </w:p>
-        </w:tc>
-        <w:tc>
-          <w:tcPr/>
-          <w:p>
-            <w:pPr>
-              <w:pStyle w:val="Compact"/>
-            </w:pPr>
-            <w:r>
-              <w:t xml:space="preserve">0.0%</w:t>
+              <w:t xml:space="preserve">Rasuwagadhi</w:t>
+            </w:r>
+          </w:p>
+        </w:tc>
+        <w:tc>
+          <w:tcPr/>
+          <w:p>
+            <w:pPr>
+              <w:pStyle w:val="Compact"/>
+            </w:pPr>
+            <w:r>
+              <w:t xml:space="preserve">1,521</w:t>
+            </w:r>
+          </w:p>
+        </w:tc>
+        <w:tc>
+          <w:tcPr/>
+          <w:p>
+            <w:pPr>
+              <w:pStyle w:val="Compact"/>
+            </w:pPr>
+            <w:r>
+              <w:t xml:space="preserve">1</w:t>
+            </w:r>
+          </w:p>
+        </w:tc>
+        <w:tc>
+          <w:tcPr/>
+          <w:p>
+            <w:pPr>
+              <w:pStyle w:val="Compact"/>
+            </w:pPr>
+            <w:r>
+              <w:t xml:space="preserve">58</w:t>
+            </w:r>
+          </w:p>
+        </w:tc>
+        <w:tc>
+          <w:tcPr/>
+          <w:p>
+            <w:pPr>
+              <w:pStyle w:val="Compact"/>
+            </w:pPr>
+            <w:r>
+              <w:t xml:space="preserve">133</w:t>
+            </w:r>
+          </w:p>
+        </w:tc>
+        <w:tc>
+          <w:tcPr/>
+          <w:p>
+            <w:pPr>
+              <w:pStyle w:val="Compact"/>
+            </w:pPr>
+            <w:r>
+              <w:t xml:space="preserve">5,513</w:t>
+            </w:r>
+          </w:p>
+        </w:tc>
+        <w:tc>
+          <w:tcPr/>
+          <w:p>
+            <w:pPr>
+              <w:pStyle w:val="Compact"/>
+            </w:pPr>
+            <w:r>
+              <w:t xml:space="preserve">3,938–9,188</w:t>
             </w:r>
           </w:p>
         </w:tc>
@@ -5430,73 +5521,73 @@
               <w:pStyle w:val="Compact"/>
             </w:pPr>
             <w:r>
-              <w:t xml:space="preserve">Chameliya/Nayalbadi</w:t>
-            </w:r>
-          </w:p>
-        </w:tc>
-        <w:tc>
-          <w:tcPr/>
-          <w:p>
-            <w:pPr>
-              <w:pStyle w:val="Compact"/>
-            </w:pPr>
-            <w:r>
-              <w:t xml:space="preserve">83%</w:t>
-            </w:r>
-          </w:p>
-        </w:tc>
-        <w:tc>
-          <w:tcPr/>
-          <w:p>
-            <w:pPr>
-              <w:pStyle w:val="Compact"/>
-            </w:pPr>
-            <w:r>
-              <w:t xml:space="preserve">66%</w:t>
-            </w:r>
-          </w:p>
-        </w:tc>
-        <w:tc>
-          <w:tcPr/>
-          <w:p>
-            <w:pPr>
-              <w:pStyle w:val="Compact"/>
-            </w:pPr>
-            <w:r>
-              <w:t xml:space="preserve">0.98</w:t>
-            </w:r>
-          </w:p>
-        </w:tc>
-        <w:tc>
-          <w:tcPr/>
-          <w:p>
-            <w:pPr>
-              <w:pStyle w:val="Compact"/>
-            </w:pPr>
-            <w:r>
-              <w:t xml:space="preserve">8.1</w:t>
-            </w:r>
-          </w:p>
-        </w:tc>
-        <w:tc>
-          <w:tcPr/>
-          <w:p>
-            <w:pPr>
-              <w:pStyle w:val="Compact"/>
-            </w:pPr>
-            <w:r>
-              <w:t xml:space="preserve">42.8</w:t>
-            </w:r>
-          </w:p>
-        </w:tc>
-        <w:tc>
-          <w:tcPr/>
-          <w:p>
-            <w:pPr>
-              <w:pStyle w:val="Compact"/>
-            </w:pPr>
-            <w:r>
-              <w:t xml:space="preserve">0.0%</w:t>
+              <w:t xml:space="preserve">Bhada Bridge</w:t>
+            </w:r>
+          </w:p>
+        </w:tc>
+        <w:tc>
+          <w:tcPr/>
+          <w:p>
+            <w:pPr>
+              <w:pStyle w:val="Compact"/>
+            </w:pPr>
+            <w:r>
+              <w:t xml:space="preserve">1,464</w:t>
+            </w:r>
+          </w:p>
+        </w:tc>
+        <w:tc>
+          <w:tcPr/>
+          <w:p>
+            <w:pPr>
+              <w:pStyle w:val="Compact"/>
+            </w:pPr>
+            <w:r>
+              <w:t xml:space="preserve">1</w:t>
+            </w:r>
+          </w:p>
+        </w:tc>
+        <w:tc>
+          <w:tcPr/>
+          <w:p>
+            <w:pPr>
+              <w:pStyle w:val="Compact"/>
+            </w:pPr>
+            <w:r>
+              <w:t xml:space="preserve">30</w:t>
+            </w:r>
+          </w:p>
+        </w:tc>
+        <w:tc>
+          <w:tcPr/>
+          <w:p>
+            <w:pPr>
+              <w:pStyle w:val="Compact"/>
+            </w:pPr>
+            <w:r>
+              <w:t xml:space="preserve">65</w:t>
+            </w:r>
+          </w:p>
+        </w:tc>
+        <w:tc>
+          <w:tcPr/>
+          <w:p>
+            <w:pPr>
+              <w:pStyle w:val="Compact"/>
+            </w:pPr>
+            <w:r>
+              <w:t xml:space="preserve">2,820</w:t>
+            </w:r>
+          </w:p>
+        </w:tc>
+        <w:tc>
+          <w:tcPr/>
+          <w:p>
+            <w:pPr>
+              <w:pStyle w:val="Compact"/>
+            </w:pPr>
+            <w:r>
+              <w:t xml:space="preserve">2,014–4,700</w:t>
             </w:r>
           </w:p>
         </w:tc>
@@ -5509,73 +5600,73 @@
               <w:pStyle w:val="Compact"/>
             </w:pPr>
             <w:r>
-              <w:t xml:space="preserve">Khokana</w:t>
-            </w:r>
-          </w:p>
-        </w:tc>
-        <w:tc>
-          <w:tcPr/>
-          <w:p>
-            <w:pPr>
-              <w:pStyle w:val="Compact"/>
-            </w:pPr>
-            <w:r>
-              <w:t xml:space="preserve">81%</w:t>
-            </w:r>
-          </w:p>
-        </w:tc>
-        <w:tc>
-          <w:tcPr/>
-          <w:p>
-            <w:pPr>
-              <w:pStyle w:val="Compact"/>
-            </w:pPr>
-            <w:r>
-              <w:t xml:space="preserve">85%</w:t>
-            </w:r>
-          </w:p>
-        </w:tc>
-        <w:tc>
-          <w:tcPr/>
-          <w:p>
-            <w:pPr>
-              <w:pStyle w:val="Compact"/>
-            </w:pPr>
-            <w:r>
-              <w:t xml:space="preserve">1.99</w:t>
-            </w:r>
-          </w:p>
-        </w:tc>
-        <w:tc>
-          <w:tcPr/>
-          <w:p>
-            <w:pPr>
-              <w:pStyle w:val="Compact"/>
-            </w:pPr>
-            <w:r>
-              <w:t xml:space="preserve">64.4</w:t>
-            </w:r>
-          </w:p>
-        </w:tc>
-        <w:tc>
-          <w:tcPr/>
-          <w:p>
-            <w:pPr>
-              <w:pStyle w:val="Compact"/>
-            </w:pPr>
-            <w:r>
-              <w:t xml:space="preserve">54.1</w:t>
-            </w:r>
-          </w:p>
-        </w:tc>
-        <w:tc>
-          <w:tcPr/>
-          <w:p>
-            <w:pPr>
-              <w:pStyle w:val="Compact"/>
-            </w:pPr>
-            <w:r>
-              <w:t xml:space="preserve">0.0%</w:t>
+              <w:t xml:space="preserve">Bahrabise</w:t>
+            </w:r>
+          </w:p>
+        </w:tc>
+        <w:tc>
+          <w:tcPr/>
+          <w:p>
+            <w:pPr>
+              <w:pStyle w:val="Compact"/>
+            </w:pPr>
+            <w:r>
+              <w:t xml:space="preserve">1,899</w:t>
+            </w:r>
+          </w:p>
+        </w:tc>
+        <w:tc>
+          <w:tcPr/>
+          <w:p>
+            <w:pPr>
+              <w:pStyle w:val="Compact"/>
+            </w:pPr>
+            <w:r>
+              <w:t xml:space="preserve">5</w:t>
+            </w:r>
+          </w:p>
+        </w:tc>
+        <w:tc>
+          <w:tcPr/>
+          <w:p>
+            <w:pPr>
+              <w:pStyle w:val="Compact"/>
+            </w:pPr>
+            <w:r>
+              <w:t xml:space="preserve">168</w:t>
+            </w:r>
+          </w:p>
+        </w:tc>
+        <w:tc>
+          <w:tcPr/>
+          <w:p>
+            <w:pPr>
+              <w:pStyle w:val="Compact"/>
+            </w:pPr>
+            <w:r>
+              <w:t xml:space="preserve">84</w:t>
+            </w:r>
+          </w:p>
+        </w:tc>
+        <w:tc>
+          <w:tcPr/>
+          <w:p>
+            <w:pPr>
+              <w:pStyle w:val="Compact"/>
+            </w:pPr>
+            <w:r>
+              <w:t xml:space="preserve">2,795</w:t>
+            </w:r>
+          </w:p>
+        </w:tc>
+        <w:tc>
+          <w:tcPr/>
+          <w:p>
+            <w:pPr>
+              <w:pStyle w:val="Compact"/>
+            </w:pPr>
+            <w:r>
+              <w:t xml:space="preserve">1,997–4,659</w:t>
             </w:r>
           </w:p>
         </w:tc>
@@ -5588,73 +5679,73 @@
               <w:pStyle w:val="Compact"/>
             </w:pPr>
             <w:r>
-              <w:t xml:space="preserve">Rasuwagadhi</w:t>
-            </w:r>
-          </w:p>
-        </w:tc>
-        <w:tc>
-          <w:tcPr/>
-          <w:p>
-            <w:pPr>
-              <w:pStyle w:val="Compact"/>
-            </w:pPr>
-            <w:r>
-              <w:t xml:space="preserve">62%</w:t>
-            </w:r>
-          </w:p>
-        </w:tc>
-        <w:tc>
-          <w:tcPr/>
-          <w:p>
-            <w:pPr>
-              <w:pStyle w:val="Compact"/>
-            </w:pPr>
-            <w:r>
-              <w:t xml:space="preserve">82%</w:t>
-            </w:r>
-          </w:p>
-        </w:tc>
-        <w:tc>
-          <w:tcPr/>
-          <w:p>
-            <w:pPr>
-              <w:pStyle w:val="Compact"/>
-            </w:pPr>
-            <w:r>
-              <w:t xml:space="preserve">1.21</w:t>
-            </w:r>
-          </w:p>
-        </w:tc>
-        <w:tc>
-          <w:tcPr/>
-          <w:p>
-            <w:pPr>
-              <w:pStyle w:val="Compact"/>
-            </w:pPr>
-            <w:r>
-              <w:t xml:space="preserve">12.5</w:t>
-            </w:r>
-          </w:p>
-        </w:tc>
-        <w:tc>
-          <w:tcPr/>
-          <w:p>
-            <w:pPr>
-              <w:pStyle w:val="Compact"/>
-            </w:pPr>
-            <w:r>
-              <w:t xml:space="preserve">37.6</w:t>
-            </w:r>
-          </w:p>
-        </w:tc>
-        <w:tc>
-          <w:tcPr/>
-          <w:p>
-            <w:pPr>
-              <w:pStyle w:val="Compact"/>
-            </w:pPr>
-            <w:r>
-              <w:t xml:space="preserve">0.0%</w:t>
+              <w:t xml:space="preserve">Belsot</w:t>
+            </w:r>
+          </w:p>
+        </w:tc>
+        <w:tc>
+          <w:tcPr/>
+          <w:p>
+            <w:pPr>
+              <w:pStyle w:val="Compact"/>
+            </w:pPr>
+            <w:r>
+              <w:t xml:space="preserve">1,331</w:t>
+            </w:r>
+          </w:p>
+        </w:tc>
+        <w:tc>
+          <w:tcPr/>
+          <w:p>
+            <w:pPr>
+              <w:pStyle w:val="Compact"/>
+            </w:pPr>
+            <w:r>
+              <w:t xml:space="preserve">33</w:t>
+            </w:r>
+          </w:p>
+        </w:tc>
+        <w:tc>
+          <w:tcPr/>
+          <w:p>
+            <w:pPr>
+              <w:pStyle w:val="Compact"/>
+            </w:pPr>
+            <w:r>
+              <w:t xml:space="preserve">1,567</w:t>
+            </w:r>
+          </w:p>
+        </w:tc>
+        <w:tc>
+          <w:tcPr/>
+          <w:p>
+            <w:pPr>
+              <w:pStyle w:val="Compact"/>
+            </w:pPr>
+            <w:r>
+              <w:t xml:space="preserve">33</w:t>
+            </w:r>
+          </w:p>
+        </w:tc>
+        <w:tc>
+          <w:tcPr/>
+          <w:p>
+            <w:pPr>
+              <w:pStyle w:val="Compact"/>
+            </w:pPr>
+            <w:r>
+              <w:t xml:space="preserve">1,567</w:t>
+            </w:r>
+          </w:p>
+        </w:tc>
+        <w:tc>
+          <w:tcPr/>
+          <w:p>
+            <w:pPr>
+              <w:pStyle w:val="Compact"/>
+            </w:pPr>
+            <w:r>
+              <w:t xml:space="preserve">1,119–2,611</w:t>
             </w:r>
           </w:p>
         </w:tc>
@@ -5667,73 +5758,73 @@
               <w:pStyle w:val="Compact"/>
             </w:pPr>
             <w:r>
-              <w:t xml:space="preserve">Bahrabise</w:t>
-            </w:r>
-          </w:p>
-        </w:tc>
-        <w:tc>
-          <w:tcPr/>
-          <w:p>
-            <w:pPr>
-              <w:pStyle w:val="Compact"/>
-            </w:pPr>
-            <w:r>
-              <w:t xml:space="preserve">86%</w:t>
-            </w:r>
-          </w:p>
-        </w:tc>
-        <w:tc>
-          <w:tcPr/>
-          <w:p>
-            <w:pPr>
-              <w:pStyle w:val="Compact"/>
-            </w:pPr>
-            <w:r>
-              <w:t xml:space="preserve">77%</w:t>
-            </w:r>
-          </w:p>
-        </w:tc>
-        <w:tc>
-          <w:tcPr/>
-          <w:p>
-            <w:pPr>
-              <w:pStyle w:val="Compact"/>
-            </w:pPr>
-            <w:r>
-              <w:t xml:space="preserve">1.15</w:t>
-            </w:r>
-          </w:p>
-        </w:tc>
-        <w:tc>
-          <w:tcPr/>
-          <w:p>
-            <w:pPr>
-              <w:pStyle w:val="Compact"/>
-            </w:pPr>
-            <w:r>
-              <w:t xml:space="preserve">12.7</w:t>
-            </w:r>
-          </w:p>
-        </w:tc>
-        <w:tc>
-          <w:tcPr/>
-          <w:p>
-            <w:pPr>
-              <w:pStyle w:val="Compact"/>
-            </w:pPr>
-            <w:r>
-              <w:t xml:space="preserve">48.6</w:t>
-            </w:r>
-          </w:p>
-        </w:tc>
-        <w:tc>
-          <w:tcPr/>
-          <w:p>
-            <w:pPr>
-              <w:pStyle w:val="Compact"/>
-            </w:pPr>
-            <w:r>
-              <w:t xml:space="preserve">0.0%</w:t>
+              <w:t xml:space="preserve">Khokana</w:t>
+            </w:r>
+          </w:p>
+        </w:tc>
+        <w:tc>
+          <w:tcPr/>
+          <w:p>
+            <w:pPr>
+              <w:pStyle w:val="Compact"/>
+            </w:pPr>
+            <w:r>
+              <w:t xml:space="preserve">2,472</w:t>
+            </w:r>
+          </w:p>
+        </w:tc>
+        <w:tc>
+          <w:tcPr/>
+          <w:p>
+            <w:pPr>
+              <w:pStyle w:val="Compact"/>
+            </w:pPr>
+            <w:r>
+              <w:t xml:space="preserve">2</w:t>
+            </w:r>
+          </w:p>
+        </w:tc>
+        <w:tc>
+          <w:tcPr/>
+          <w:p>
+            <w:pPr>
+              <w:pStyle w:val="Compact"/>
+            </w:pPr>
+            <w:r>
+              <w:t xml:space="preserve">42</w:t>
+            </w:r>
+          </w:p>
+        </w:tc>
+        <w:tc>
+          <w:tcPr/>
+          <w:p>
+            <w:pPr>
+              <w:pStyle w:val="Compact"/>
+            </w:pPr>
+            <w:r>
+              <w:t xml:space="preserve">49</w:t>
+            </w:r>
+          </w:p>
+        </w:tc>
+        <w:tc>
+          <w:tcPr/>
+          <w:p>
+            <w:pPr>
+              <w:pStyle w:val="Compact"/>
+            </w:pPr>
+            <w:r>
+              <w:t xml:space="preserve">1,250</w:t>
+            </w:r>
+          </w:p>
+        </w:tc>
+        <w:tc>
+          <w:tcPr/>
+          <w:p>
+            <w:pPr>
+              <w:pStyle w:val="Compact"/>
+            </w:pPr>
+            <w:r>
+              <w:t xml:space="preserve">893–2,083</w:t>
             </w:r>
           </w:p>
         </w:tc>
@@ -5746,73 +5837,73 @@
               <w:pStyle w:val="Compact"/>
             </w:pPr>
             <w:r>
-              <w:t xml:space="preserve">Chisapani</w:t>
-            </w:r>
-          </w:p>
-        </w:tc>
-        <w:tc>
-          <w:tcPr/>
-          <w:p>
-            <w:pPr>
-              <w:pStyle w:val="Compact"/>
-            </w:pPr>
-            <w:r>
-              <w:t xml:space="preserve">89%</w:t>
-            </w:r>
-          </w:p>
-        </w:tc>
-        <w:tc>
-          <w:tcPr/>
-          <w:p>
-            <w:pPr>
-              <w:pStyle w:val="Compact"/>
-            </w:pPr>
-            <w:r>
-              <w:t xml:space="preserve">74%</w:t>
-            </w:r>
-          </w:p>
-        </w:tc>
-        <w:tc>
-          <w:tcPr/>
-          <w:p>
-            <w:pPr>
-              <w:pStyle w:val="Compact"/>
-            </w:pPr>
-            <w:r>
-              <w:t xml:space="preserve">1.08</w:t>
-            </w:r>
-          </w:p>
-        </w:tc>
-        <w:tc>
-          <w:tcPr/>
-          <w:p>
-            <w:pPr>
-              <w:pStyle w:val="Compact"/>
-            </w:pPr>
-            <w:r>
-              <w:t xml:space="preserve">9.8</w:t>
-            </w:r>
-          </w:p>
-        </w:tc>
-        <w:tc>
-          <w:tcPr/>
-          <w:p>
-            <w:pPr>
-              <w:pStyle w:val="Compact"/>
-            </w:pPr>
-            <w:r>
-              <w:t xml:space="preserve">41.5</w:t>
-            </w:r>
-          </w:p>
-        </w:tc>
-        <w:tc>
-          <w:tcPr/>
-          <w:p>
-            <w:pPr>
-              <w:pStyle w:val="Compact"/>
-            </w:pPr>
-            <w:r>
-              <w:t xml:space="preserve">0.0%</w:t>
+              <w:t xml:space="preserve">Chameliya/Nayalbadi</w:t>
+            </w:r>
+          </w:p>
+        </w:tc>
+        <w:tc>
+          <w:tcPr/>
+          <w:p>
+            <w:pPr>
+              <w:pStyle w:val="Compact"/>
+            </w:pPr>
+            <w:r>
+              <w:t xml:space="preserve">1,854</w:t>
+            </w:r>
+          </w:p>
+        </w:tc>
+        <w:tc>
+          <w:tcPr/>
+          <w:p>
+            <w:pPr>
+              <w:pStyle w:val="Compact"/>
+            </w:pPr>
+            <w:r>
+              <w:t xml:space="preserve">31</w:t>
+            </w:r>
+          </w:p>
+        </w:tc>
+        <w:tc>
+          <w:tcPr/>
+          <w:p>
+            <w:pPr>
+              <w:pStyle w:val="Compact"/>
+            </w:pPr>
+            <w:r>
+              <w:t xml:space="preserve">1,069</w:t>
+            </w:r>
+          </w:p>
+        </w:tc>
+        <w:tc>
+          <w:tcPr/>
+          <w:p>
+            <w:pPr>
+              <w:pStyle w:val="Compact"/>
+            </w:pPr>
+            <w:r>
+              <w:t xml:space="preserve">31</w:t>
+            </w:r>
+          </w:p>
+        </w:tc>
+        <w:tc>
+          <w:tcPr/>
+          <w:p>
+            <w:pPr>
+              <w:pStyle w:val="Compact"/>
+            </w:pPr>
+            <w:r>
+              <w:t xml:space="preserve">1,069</w:t>
+            </w:r>
+          </w:p>
+        </w:tc>
+        <w:tc>
+          <w:tcPr/>
+          <w:p>
+            <w:pPr>
+              <w:pStyle w:val="Compact"/>
+            </w:pPr>
+            <w:r>
+              <w:t xml:space="preserve">763–1,781</w:t>
             </w:r>
           </w:p>
         </w:tc>
@@ -5827,7 +5918,1050 @@
           <w:b/>
           <w:bCs/>
         </w:rPr>
-        <w:t xml:space="preserve">Table 5. Data-quality diagnostics per location, corrected discharge.</w:t>
+        <w:t xml:space="preserve">A5 — Quantisation and repeated values (consequence of A4).</w:t>
+      </w:r>
+      <w:r>
+        <w:t xml:space="preserve"> </w:t>
+      </w:r>
+      <w:r>
+        <w:t xml:space="preserve">In the V2 series, 64 % of Bhada Bridge days and 51 % of Chisapani days had discharge identical to the previous day, because flows were so small that they were rounded at the second decimal. In the corrected series the repeated-value fraction is 2–13 % at every location (Table 6).</w:t>
+      </w:r>
+    </w:p>
+    <w:p>
+      <w:pPr>
+        <w:pStyle w:val="BodyText"/>
+      </w:pPr>
+      <w:r>
+        <w:rPr>
+          <w:b/>
+          <w:bCs/>
+        </w:rPr>
+        <w:t xml:space="preserve">A6 — Intermittent zero flow (consequence of A4).</w:t>
+      </w:r>
+      <w:r>
+        <w:t xml:space="preserve"> </w:t>
+      </w:r>
+      <w:r>
+        <w:t xml:space="preserve">The V2 series had 223 days of exactly zero discharge at Khokana (16.7 % of the record). The corrected series has none (its 5th percentile is 0.1 m³/s), so the apparent intermittency was an artefact of the small cell and no zero-flow model is needed.</w:t>
+      </w:r>
+    </w:p>
+    <w:p>
+      <w:pPr>
+        <w:pStyle w:val="BodyText"/>
+      </w:pPr>
+      <w:r>
+        <w:rPr>
+          <w:b/>
+          <w:bCs/>
+        </w:rPr>
+        <w:t xml:space="preserve">A7 — Elevation field plausibility.</w:t>
+      </w:r>
+      <w:r>
+        <w:t xml:space="preserve"> </w:t>
+      </w:r>
+      <w:r>
+        <w:t xml:space="preserve">The</w:t>
+      </w:r>
+      <w:r>
+        <w:t xml:space="preserve"> </w:t>
+      </w:r>
+      <w:r>
+        <w:rPr>
+          <w:rStyle w:val="VerbatimChar"/>
+        </w:rPr>
+        <w:t xml:space="preserve">elevation_m</w:t>
+      </w:r>
+      <w:r>
+        <w:t xml:space="preserve"> </w:t>
+      </w:r>
+      <w:r>
+        <w:t xml:space="preserve">field gives Chisapani as 2,215 m, but its mean temperature is 23.1 °C, similar to the 150–230 m sites (23.9–24.6 °C) and far above the 17.5 °C of the 1,749 m Rasuwagadhi site. A 2,215 m Nepal site with a 23 °C annual mean is not plausible. We therefore</w:t>
+      </w:r>
+      <w:r>
+        <w:t xml:space="preserve"> </w:t>
+      </w:r>
+      <w:r>
+        <w:rPr>
+          <w:b/>
+          <w:bCs/>
+        </w:rPr>
+        <w:t xml:space="preserve">do not treat</w:t>
+      </w:r>
+      <w:r>
+        <w:rPr>
+          <w:b/>
+          <w:bCs/>
+        </w:rPr>
+        <w:t xml:space="preserve"> </w:t>
+      </w:r>
+      <w:r>
+        <w:rPr>
+          <w:rStyle w:val="VerbatimChar"/>
+          <w:b/>
+          <w:bCs/>
+        </w:rPr>
+        <w:t xml:space="preserve">elevation_m</w:t>
+      </w:r>
+      <w:r>
+        <w:rPr>
+          <w:b/>
+          <w:bCs/>
+        </w:rPr>
+        <w:t xml:space="preserve"> </w:t>
+      </w:r>
+      <w:r>
+        <w:rPr>
+          <w:b/>
+          <w:bCs/>
+        </w:rPr>
+        <w:t xml:space="preserve">as a physical covariate</w:t>
+      </w:r>
+      <w:r>
+        <w:t xml:space="preserve"> </w:t>
+      </w:r>
+      <w:r>
+        <w:t xml:space="preserve">and run models with and without it.</w:t>
+      </w:r>
+      <w:r>
+        <w:t xml:space="preserve"> </w:t>
+      </w:r>
+      <w:r>
+        <w:rPr>
+          <w:i/>
+          <w:iCs/>
+        </w:rPr>
+        <w:t xml:space="preserve">Fail, unresolved.</w:t>
+      </w:r>
+    </w:p>
+    <w:p>
+      <w:pPr>
+        <w:pStyle w:val="BodyText"/>
+      </w:pPr>
+      <w:r>
+        <w:rPr>
+          <w:b/>
+          <w:bCs/>
+        </w:rPr>
+        <w:t xml:space="preserve">A8 — Dates beyond the present.</w:t>
+      </w:r>
+      <w:r>
+        <w:t xml:space="preserve"> </w:t>
+      </w:r>
+      <w:r>
+        <w:t xml:space="preserve">The panel ends on 31 August 2026 and contains the 2026 monsoon through that date. The documentation mentions a 2026 flood in the Rasuwa and Bhote Koshi–Trishuli corridor without giving its date, so it cannot be tested directly (Section 8.8).</w:t>
+      </w:r>
+    </w:p>
+    <w:p>
+      <w:pPr>
+        <w:pStyle w:val="BodyText"/>
+      </w:pPr>
+      <w:r>
+        <w:rPr>
+          <w:b/>
+          <w:bCs/>
+        </w:rPr>
+        <w:t xml:space="preserve">Table 5. Seasonality and tail diagnostics per location (June–September = monsoon), corrected discharge.</w:t>
+      </w:r>
+    </w:p>
+    <w:tbl>
+      <w:tblPr>
+        <w:tblStyle w:val="Table"/>
+        <w:tblW w:type="pct" w:w="5000"/>
+        <w:tblLayout w:type="fixed"/>
+        <w:tblLook w:firstRow="1" w:lastRow="0" w:firstColumn="0" w:lastColumn="0" w:noHBand="0" w:noVBand="0" w:val="0020"/>
+      </w:tblPr>
+      <w:tblGrid>
+        <w:gridCol w:w="1131"/>
+        <w:gridCol w:w="1131"/>
+        <w:gridCol w:w="1131"/>
+        <w:gridCol w:w="1131"/>
+        <w:gridCol w:w="1131"/>
+        <w:gridCol w:w="1131"/>
+        <w:gridCol w:w="1131"/>
+      </w:tblGrid>
+      <w:tr>
+        <w:trPr>
+          <w:tblHeader w:val="on"/>
+        </w:trPr>
+        <w:tc>
+          <w:tcPr/>
+          <w:p>
+            <w:pPr>
+              <w:pStyle w:val="Compact"/>
+            </w:pPr>
+            <w:r>
+              <w:t xml:space="preserve">location</w:t>
+            </w:r>
+          </w:p>
+        </w:tc>
+        <w:tc>
+          <w:tcPr/>
+          <w:p>
+            <w:pPr>
+              <w:pStyle w:val="Compact"/>
+            </w:pPr>
+            <w:r>
+              <w:t xml:space="preserve">Monsoon (JJAS) share of P</w:t>
+            </w:r>
+          </w:p>
+        </w:tc>
+        <w:tc>
+          <w:tcPr/>
+          <w:p>
+            <w:pPr>
+              <w:pStyle w:val="Compact"/>
+            </w:pPr>
+            <w:r>
+              <w:t xml:space="preserve">Monsoon share of Q</w:t>
+            </w:r>
+          </w:p>
+        </w:tc>
+        <w:tc>
+          <w:tcPr/>
+          <w:p>
+            <w:pPr>
+              <w:pStyle w:val="Compact"/>
+            </w:pPr>
+            <w:r>
+              <w:t xml:space="preserve">CV of Q</w:t>
+            </w:r>
+          </w:p>
+        </w:tc>
+        <w:tc>
+          <w:tcPr/>
+          <w:p>
+            <w:pPr>
+              <w:pStyle w:val="Compact"/>
+            </w:pPr>
+            <w:r>
+              <w:t xml:space="preserve">Q99 / median</w:t>
+            </w:r>
+          </w:p>
+        </w:tc>
+        <w:tc>
+          <w:tcPr/>
+          <w:p>
+            <w:pPr>
+              <w:pStyle w:val="Compact"/>
+            </w:pPr>
+            <w:r>
+              <w:t xml:space="preserve">P99 (mm/d)</w:t>
+            </w:r>
+          </w:p>
+        </w:tc>
+        <w:tc>
+          <w:tcPr/>
+          <w:p>
+            <w:pPr>
+              <w:pStyle w:val="Compact"/>
+            </w:pPr>
+            <w:r>
+              <w:t xml:space="preserve">Zero-Q days</w:t>
+            </w:r>
+          </w:p>
+        </w:tc>
+      </w:tr>
+      <w:tr>
+        <w:tc>
+          <w:tcPr/>
+          <w:p>
+            <w:pPr>
+              <w:pStyle w:val="Compact"/>
+            </w:pPr>
+            <w:r>
+              <w:t xml:space="preserve">Chatara</w:t>
+            </w:r>
+          </w:p>
+        </w:tc>
+        <w:tc>
+          <w:tcPr/>
+          <w:p>
+            <w:pPr>
+              <w:pStyle w:val="Compact"/>
+            </w:pPr>
+            <w:r>
+              <w:t xml:space="preserve">77%</w:t>
+            </w:r>
+          </w:p>
+        </w:tc>
+        <w:tc>
+          <w:tcPr/>
+          <w:p>
+            <w:pPr>
+              <w:pStyle w:val="Compact"/>
+            </w:pPr>
+            <w:r>
+              <w:t xml:space="preserve">70%</w:t>
+            </w:r>
+          </w:p>
+        </w:tc>
+        <w:tc>
+          <w:tcPr/>
+          <w:p>
+            <w:pPr>
+              <w:pStyle w:val="Compact"/>
+            </w:pPr>
+            <w:r>
+              <w:t xml:space="preserve">0.94</w:t>
+            </w:r>
+          </w:p>
+        </w:tc>
+        <w:tc>
+          <w:tcPr/>
+          <w:p>
+            <w:pPr>
+              <w:pStyle w:val="Compact"/>
+            </w:pPr>
+            <w:r>
+              <w:t xml:space="preserve">7.5</w:t>
+            </w:r>
+          </w:p>
+        </w:tc>
+        <w:tc>
+          <w:tcPr/>
+          <w:p>
+            <w:pPr>
+              <w:pStyle w:val="Compact"/>
+            </w:pPr>
+            <w:r>
+              <w:t xml:space="preserve">51.4</w:t>
+            </w:r>
+          </w:p>
+        </w:tc>
+        <w:tc>
+          <w:tcPr/>
+          <w:p>
+            <w:pPr>
+              <w:pStyle w:val="Compact"/>
+            </w:pPr>
+            <w:r>
+              <w:t xml:space="preserve">0.0%</w:t>
+            </w:r>
+          </w:p>
+        </w:tc>
+      </w:tr>
+      <w:tr>
+        <w:tc>
+          <w:tcPr/>
+          <w:p>
+            <w:pPr>
+              <w:pStyle w:val="Compact"/>
+            </w:pPr>
+            <w:r>
+              <w:t xml:space="preserve">Bhada Bridge</w:t>
+            </w:r>
+          </w:p>
+        </w:tc>
+        <w:tc>
+          <w:tcPr/>
+          <w:p>
+            <w:pPr>
+              <w:pStyle w:val="Compact"/>
+            </w:pPr>
+            <w:r>
+              <w:t xml:space="preserve">89%</w:t>
+            </w:r>
+          </w:p>
+        </w:tc>
+        <w:tc>
+          <w:tcPr/>
+          <w:p>
+            <w:pPr>
+              <w:pStyle w:val="Compact"/>
+            </w:pPr>
+            <w:r>
+              <w:t xml:space="preserve">85%</w:t>
+            </w:r>
+          </w:p>
+        </w:tc>
+        <w:tc>
+          <w:tcPr/>
+          <w:p>
+            <w:pPr>
+              <w:pStyle w:val="Compact"/>
+            </w:pPr>
+            <w:r>
+              <w:t xml:space="preserve">1.89</w:t>
+            </w:r>
+          </w:p>
+        </w:tc>
+        <w:tc>
+          <w:tcPr/>
+          <w:p>
+            <w:pPr>
+              <w:pStyle w:val="Compact"/>
+            </w:pPr>
+            <w:r>
+              <w:t xml:space="preserve">71.5</w:t>
+            </w:r>
+          </w:p>
+        </w:tc>
+        <w:tc>
+          <w:tcPr/>
+          <w:p>
+            <w:pPr>
+              <w:pStyle w:val="Compact"/>
+            </w:pPr>
+            <w:r>
+              <w:t xml:space="preserve">40.5</w:t>
+            </w:r>
+          </w:p>
+        </w:tc>
+        <w:tc>
+          <w:tcPr/>
+          <w:p>
+            <w:pPr>
+              <w:pStyle w:val="Compact"/>
+            </w:pPr>
+            <w:r>
+              <w:t xml:space="preserve">0.0%</w:t>
+            </w:r>
+          </w:p>
+        </w:tc>
+      </w:tr>
+      <w:tr>
+        <w:tc>
+          <w:tcPr/>
+          <w:p>
+            <w:pPr>
+              <w:pStyle w:val="Compact"/>
+            </w:pPr>
+            <w:r>
+              <w:t xml:space="preserve">Belsot</w:t>
+            </w:r>
+          </w:p>
+        </w:tc>
+        <w:tc>
+          <w:tcPr/>
+          <w:p>
+            <w:pPr>
+              <w:pStyle w:val="Compact"/>
+            </w:pPr>
+            <w:r>
+              <w:t xml:space="preserve">73%</w:t>
+            </w:r>
+          </w:p>
+        </w:tc>
+        <w:tc>
+          <w:tcPr/>
+          <w:p>
+            <w:pPr>
+              <w:pStyle w:val="Compact"/>
+            </w:pPr>
+            <w:r>
+              <w:t xml:space="preserve">63%</w:t>
+            </w:r>
+          </w:p>
+        </w:tc>
+        <w:tc>
+          <w:tcPr/>
+          <w:p>
+            <w:pPr>
+              <w:pStyle w:val="Compact"/>
+            </w:pPr>
+            <w:r>
+              <w:t xml:space="preserve">1.18</w:t>
+            </w:r>
+          </w:p>
+        </w:tc>
+        <w:tc>
+          <w:tcPr/>
+          <w:p>
+            <w:pPr>
+              <w:pStyle w:val="Compact"/>
+            </w:pPr>
+            <w:r>
+              <w:t xml:space="preserve">15.6</w:t>
+            </w:r>
+          </w:p>
+        </w:tc>
+        <w:tc>
+          <w:tcPr/>
+          <w:p>
+            <w:pPr>
+              <w:pStyle w:val="Compact"/>
+            </w:pPr>
+            <w:r>
+              <w:t xml:space="preserve">46.7</w:t>
+            </w:r>
+          </w:p>
+        </w:tc>
+        <w:tc>
+          <w:tcPr/>
+          <w:p>
+            <w:pPr>
+              <w:pStyle w:val="Compact"/>
+            </w:pPr>
+            <w:r>
+              <w:t xml:space="preserve">0.0%</w:t>
+            </w:r>
+          </w:p>
+        </w:tc>
+      </w:tr>
+      <w:tr>
+        <w:tc>
+          <w:tcPr/>
+          <w:p>
+            <w:pPr>
+              <w:pStyle w:val="Compact"/>
+            </w:pPr>
+            <w:r>
+              <w:t xml:space="preserve">Kusum</w:t>
+            </w:r>
+          </w:p>
+        </w:tc>
+        <w:tc>
+          <w:tcPr/>
+          <w:p>
+            <w:pPr>
+              <w:pStyle w:val="Compact"/>
+            </w:pPr>
+            <w:r>
+              <w:t xml:space="preserve">85%</w:t>
+            </w:r>
+          </w:p>
+        </w:tc>
+        <w:tc>
+          <w:tcPr/>
+          <w:p>
+            <w:pPr>
+              <w:pStyle w:val="Compact"/>
+            </w:pPr>
+            <w:r>
+              <w:t xml:space="preserve">85%</w:t>
+            </w:r>
+          </w:p>
+        </w:tc>
+        <w:tc>
+          <w:tcPr/>
+          <w:p>
+            <w:pPr>
+              <w:pStyle w:val="Compact"/>
+            </w:pPr>
+            <w:r>
+              <w:t xml:space="preserve">1.86</w:t>
+            </w:r>
+          </w:p>
+        </w:tc>
+        <w:tc>
+          <w:tcPr/>
+          <w:p>
+            <w:pPr>
+              <w:pStyle w:val="Compact"/>
+            </w:pPr>
+            <w:r>
+              <w:t xml:space="preserve">56.9</w:t>
+            </w:r>
+          </w:p>
+        </w:tc>
+        <w:tc>
+          <w:tcPr/>
+          <w:p>
+            <w:pPr>
+              <w:pStyle w:val="Compact"/>
+            </w:pPr>
+            <w:r>
+              <w:t xml:space="preserve">29.4</w:t>
+            </w:r>
+          </w:p>
+        </w:tc>
+        <w:tc>
+          <w:tcPr/>
+          <w:p>
+            <w:pPr>
+              <w:pStyle w:val="Compact"/>
+            </w:pPr>
+            <w:r>
+              <w:t xml:space="preserve">0.0%</w:t>
+            </w:r>
+          </w:p>
+        </w:tc>
+      </w:tr>
+      <w:tr>
+        <w:tc>
+          <w:tcPr/>
+          <w:p>
+            <w:pPr>
+              <w:pStyle w:val="Compact"/>
+            </w:pPr>
+            <w:r>
+              <w:t xml:space="preserve">Devghat</w:t>
+            </w:r>
+          </w:p>
+        </w:tc>
+        <w:tc>
+          <w:tcPr/>
+          <w:p>
+            <w:pPr>
+              <w:pStyle w:val="Compact"/>
+            </w:pPr>
+            <w:r>
+              <w:t xml:space="preserve">79%</w:t>
+            </w:r>
+          </w:p>
+        </w:tc>
+        <w:tc>
+          <w:tcPr/>
+          <w:p>
+            <w:pPr>
+              <w:pStyle w:val="Compact"/>
+            </w:pPr>
+            <w:r>
+              <w:t xml:space="preserve">76%</w:t>
+            </w:r>
+          </w:p>
+        </w:tc>
+        <w:tc>
+          <w:tcPr/>
+          <w:p>
+            <w:pPr>
+              <w:pStyle w:val="Compact"/>
+            </w:pPr>
+            <w:r>
+              <w:t xml:space="preserve">1.12</w:t>
+            </w:r>
+          </w:p>
+        </w:tc>
+        <w:tc>
+          <w:tcPr/>
+          <w:p>
+            <w:pPr>
+              <w:pStyle w:val="Compact"/>
+            </w:pPr>
+            <w:r>
+              <w:t xml:space="preserve">10.5</w:t>
+            </w:r>
+          </w:p>
+        </w:tc>
+        <w:tc>
+          <w:tcPr/>
+          <w:p>
+            <w:pPr>
+              <w:pStyle w:val="Compact"/>
+            </w:pPr>
+            <w:r>
+              <w:t xml:space="preserve">48.2</w:t>
+            </w:r>
+          </w:p>
+        </w:tc>
+        <w:tc>
+          <w:tcPr/>
+          <w:p>
+            <w:pPr>
+              <w:pStyle w:val="Compact"/>
+            </w:pPr>
+            <w:r>
+              <w:t xml:space="preserve">0.0%</w:t>
+            </w:r>
+          </w:p>
+        </w:tc>
+      </w:tr>
+      <w:tr>
+        <w:tc>
+          <w:tcPr/>
+          <w:p>
+            <w:pPr>
+              <w:pStyle w:val="Compact"/>
+            </w:pPr>
+            <w:r>
+              <w:t xml:space="preserve">Chameliya/Nayalbadi</w:t>
+            </w:r>
+          </w:p>
+        </w:tc>
+        <w:tc>
+          <w:tcPr/>
+          <w:p>
+            <w:pPr>
+              <w:pStyle w:val="Compact"/>
+            </w:pPr>
+            <w:r>
+              <w:t xml:space="preserve">83%</w:t>
+            </w:r>
+          </w:p>
+        </w:tc>
+        <w:tc>
+          <w:tcPr/>
+          <w:p>
+            <w:pPr>
+              <w:pStyle w:val="Compact"/>
+            </w:pPr>
+            <w:r>
+              <w:t xml:space="preserve">66%</w:t>
+            </w:r>
+          </w:p>
+        </w:tc>
+        <w:tc>
+          <w:tcPr/>
+          <w:p>
+            <w:pPr>
+              <w:pStyle w:val="Compact"/>
+            </w:pPr>
+            <w:r>
+              <w:t xml:space="preserve">0.98</w:t>
+            </w:r>
+          </w:p>
+        </w:tc>
+        <w:tc>
+          <w:tcPr/>
+          <w:p>
+            <w:pPr>
+              <w:pStyle w:val="Compact"/>
+            </w:pPr>
+            <w:r>
+              <w:t xml:space="preserve">8.1</w:t>
+            </w:r>
+          </w:p>
+        </w:tc>
+        <w:tc>
+          <w:tcPr/>
+          <w:p>
+            <w:pPr>
+              <w:pStyle w:val="Compact"/>
+            </w:pPr>
+            <w:r>
+              <w:t xml:space="preserve">42.8</w:t>
+            </w:r>
+          </w:p>
+        </w:tc>
+        <w:tc>
+          <w:tcPr/>
+          <w:p>
+            <w:pPr>
+              <w:pStyle w:val="Compact"/>
+            </w:pPr>
+            <w:r>
+              <w:t xml:space="preserve">0.0%</w:t>
+            </w:r>
+          </w:p>
+        </w:tc>
+      </w:tr>
+      <w:tr>
+        <w:tc>
+          <w:tcPr/>
+          <w:p>
+            <w:pPr>
+              <w:pStyle w:val="Compact"/>
+            </w:pPr>
+            <w:r>
+              <w:t xml:space="preserve">Khokana</w:t>
+            </w:r>
+          </w:p>
+        </w:tc>
+        <w:tc>
+          <w:tcPr/>
+          <w:p>
+            <w:pPr>
+              <w:pStyle w:val="Compact"/>
+            </w:pPr>
+            <w:r>
+              <w:t xml:space="preserve">81%</w:t>
+            </w:r>
+          </w:p>
+        </w:tc>
+        <w:tc>
+          <w:tcPr/>
+          <w:p>
+            <w:pPr>
+              <w:pStyle w:val="Compact"/>
+            </w:pPr>
+            <w:r>
+              <w:t xml:space="preserve">85%</w:t>
+            </w:r>
+          </w:p>
+        </w:tc>
+        <w:tc>
+          <w:tcPr/>
+          <w:p>
+            <w:pPr>
+              <w:pStyle w:val="Compact"/>
+            </w:pPr>
+            <w:r>
+              <w:t xml:space="preserve">1.99</w:t>
+            </w:r>
+          </w:p>
+        </w:tc>
+        <w:tc>
+          <w:tcPr/>
+          <w:p>
+            <w:pPr>
+              <w:pStyle w:val="Compact"/>
+            </w:pPr>
+            <w:r>
+              <w:t xml:space="preserve">64.4</w:t>
+            </w:r>
+          </w:p>
+        </w:tc>
+        <w:tc>
+          <w:tcPr/>
+          <w:p>
+            <w:pPr>
+              <w:pStyle w:val="Compact"/>
+            </w:pPr>
+            <w:r>
+              <w:t xml:space="preserve">54.1</w:t>
+            </w:r>
+          </w:p>
+        </w:tc>
+        <w:tc>
+          <w:tcPr/>
+          <w:p>
+            <w:pPr>
+              <w:pStyle w:val="Compact"/>
+            </w:pPr>
+            <w:r>
+              <w:t xml:space="preserve">0.0%</w:t>
+            </w:r>
+          </w:p>
+        </w:tc>
+      </w:tr>
+      <w:tr>
+        <w:tc>
+          <w:tcPr/>
+          <w:p>
+            <w:pPr>
+              <w:pStyle w:val="Compact"/>
+            </w:pPr>
+            <w:r>
+              <w:t xml:space="preserve">Rasuwagadhi</w:t>
+            </w:r>
+          </w:p>
+        </w:tc>
+        <w:tc>
+          <w:tcPr/>
+          <w:p>
+            <w:pPr>
+              <w:pStyle w:val="Compact"/>
+            </w:pPr>
+            <w:r>
+              <w:t xml:space="preserve">62%</w:t>
+            </w:r>
+          </w:p>
+        </w:tc>
+        <w:tc>
+          <w:tcPr/>
+          <w:p>
+            <w:pPr>
+              <w:pStyle w:val="Compact"/>
+            </w:pPr>
+            <w:r>
+              <w:t xml:space="preserve">82%</w:t>
+            </w:r>
+          </w:p>
+        </w:tc>
+        <w:tc>
+          <w:tcPr/>
+          <w:p>
+            <w:pPr>
+              <w:pStyle w:val="Compact"/>
+            </w:pPr>
+            <w:r>
+              <w:t xml:space="preserve">1.21</w:t>
+            </w:r>
+          </w:p>
+        </w:tc>
+        <w:tc>
+          <w:tcPr/>
+          <w:p>
+            <w:pPr>
+              <w:pStyle w:val="Compact"/>
+            </w:pPr>
+            <w:r>
+              <w:t xml:space="preserve">12.5</w:t>
+            </w:r>
+          </w:p>
+        </w:tc>
+        <w:tc>
+          <w:tcPr/>
+          <w:p>
+            <w:pPr>
+              <w:pStyle w:val="Compact"/>
+            </w:pPr>
+            <w:r>
+              <w:t xml:space="preserve">37.6</w:t>
+            </w:r>
+          </w:p>
+        </w:tc>
+        <w:tc>
+          <w:tcPr/>
+          <w:p>
+            <w:pPr>
+              <w:pStyle w:val="Compact"/>
+            </w:pPr>
+            <w:r>
+              <w:t xml:space="preserve">0.0%</w:t>
+            </w:r>
+          </w:p>
+        </w:tc>
+      </w:tr>
+      <w:tr>
+        <w:tc>
+          <w:tcPr/>
+          <w:p>
+            <w:pPr>
+              <w:pStyle w:val="Compact"/>
+            </w:pPr>
+            <w:r>
+              <w:t xml:space="preserve">Bahrabise</w:t>
+            </w:r>
+          </w:p>
+        </w:tc>
+        <w:tc>
+          <w:tcPr/>
+          <w:p>
+            <w:pPr>
+              <w:pStyle w:val="Compact"/>
+            </w:pPr>
+            <w:r>
+              <w:t xml:space="preserve">86%</w:t>
+            </w:r>
+          </w:p>
+        </w:tc>
+        <w:tc>
+          <w:tcPr/>
+          <w:p>
+            <w:pPr>
+              <w:pStyle w:val="Compact"/>
+            </w:pPr>
+            <w:r>
+              <w:t xml:space="preserve">77%</w:t>
+            </w:r>
+          </w:p>
+        </w:tc>
+        <w:tc>
+          <w:tcPr/>
+          <w:p>
+            <w:pPr>
+              <w:pStyle w:val="Compact"/>
+            </w:pPr>
+            <w:r>
+              <w:t xml:space="preserve">1.15</w:t>
+            </w:r>
+          </w:p>
+        </w:tc>
+        <w:tc>
+          <w:tcPr/>
+          <w:p>
+            <w:pPr>
+              <w:pStyle w:val="Compact"/>
+            </w:pPr>
+            <w:r>
+              <w:t xml:space="preserve">12.7</w:t>
+            </w:r>
+          </w:p>
+        </w:tc>
+        <w:tc>
+          <w:tcPr/>
+          <w:p>
+            <w:pPr>
+              <w:pStyle w:val="Compact"/>
+            </w:pPr>
+            <w:r>
+              <w:t xml:space="preserve">48.6</w:t>
+            </w:r>
+          </w:p>
+        </w:tc>
+        <w:tc>
+          <w:tcPr/>
+          <w:p>
+            <w:pPr>
+              <w:pStyle w:val="Compact"/>
+            </w:pPr>
+            <w:r>
+              <w:t xml:space="preserve">0.0%</w:t>
+            </w:r>
+          </w:p>
+        </w:tc>
+      </w:tr>
+      <w:tr>
+        <w:tc>
+          <w:tcPr/>
+          <w:p>
+            <w:pPr>
+              <w:pStyle w:val="Compact"/>
+            </w:pPr>
+            <w:r>
+              <w:t xml:space="preserve">Chisapani</w:t>
+            </w:r>
+          </w:p>
+        </w:tc>
+        <w:tc>
+          <w:tcPr/>
+          <w:p>
+            <w:pPr>
+              <w:pStyle w:val="Compact"/>
+            </w:pPr>
+            <w:r>
+              <w:t xml:space="preserve">89%</w:t>
+            </w:r>
+          </w:p>
+        </w:tc>
+        <w:tc>
+          <w:tcPr/>
+          <w:p>
+            <w:pPr>
+              <w:pStyle w:val="Compact"/>
+            </w:pPr>
+            <w:r>
+              <w:t xml:space="preserve">74%</w:t>
+            </w:r>
+          </w:p>
+        </w:tc>
+        <w:tc>
+          <w:tcPr/>
+          <w:p>
+            <w:pPr>
+              <w:pStyle w:val="Compact"/>
+            </w:pPr>
+            <w:r>
+              <w:t xml:space="preserve">1.08</w:t>
+            </w:r>
+          </w:p>
+        </w:tc>
+        <w:tc>
+          <w:tcPr/>
+          <w:p>
+            <w:pPr>
+              <w:pStyle w:val="Compact"/>
+            </w:pPr>
+            <w:r>
+              <w:t xml:space="preserve">9.8</w:t>
+            </w:r>
+          </w:p>
+        </w:tc>
+        <w:tc>
+          <w:tcPr/>
+          <w:p>
+            <w:pPr>
+              <w:pStyle w:val="Compact"/>
+            </w:pPr>
+            <w:r>
+              <w:t xml:space="preserve">41.5</w:t>
+            </w:r>
+          </w:p>
+        </w:tc>
+        <w:tc>
+          <w:tcPr/>
+          <w:p>
+            <w:pPr>
+              <w:pStyle w:val="Compact"/>
+            </w:pPr>
+            <w:r>
+              <w:t xml:space="preserve">0.0%</w:t>
+            </w:r>
+          </w:p>
+        </w:tc>
+      </w:tr>
+    </w:tbl>
+    <w:p>
+      <w:pPr>
+        <w:pStyle w:val="BodyText"/>
+      </w:pPr>
+      <w:r>
+        <w:rPr>
+          <w:b/>
+          <w:bCs/>
+        </w:rPr>
+        <w:t xml:space="preserve">Table 6. Data-quality diagnostics per location, corrected discharge.</w:t>
       </w:r>
       <w:r>
         <w:t xml:space="preserve"> </w:t>
@@ -7569,7 +8703,7 @@
         </m:d>
       </m:oMath>
       <w:r>
-        <w:t xml:space="preserve">. A significant break in precipitation or soil moisture near a model-version date would be a red flag for temporal validation. We ran the Pettitt test on six seasonally adjusted weather series at each of the ten locations (60 tests; Table 6; the CUSUM test was not run).</w:t>
+        <w:t xml:space="preserve">. A significant break in precipitation or soil moisture near a model-version date would be a red flag for temporal validation. We ran the Pettitt test on six seasonally adjusted weather series at each of the ten locations (60 tests; Table 7; the CUSUM test was not run).</w:t>
       </w:r>
     </w:p>
     <w:p>
@@ -7581,7 +8715,7 @@
           <w:b/>
           <w:bCs/>
         </w:rPr>
-        <w:t xml:space="preserve">Table 6. Pettitt change-point tests on seasonally adjusted weather series (10 locations per variable).</w:t>
+        <w:t xml:space="preserve">Table 7. Pettitt change-point tests on seasonally adjusted weather series (10 locations per variable).</w:t>
       </w:r>
       <w:r>
         <w:t xml:space="preserve"> </w:t>
@@ -12897,7 +14031,7 @@
         <w:pStyle w:val="FirstParagraph"/>
       </w:pPr>
       <w:r>
-        <w:t xml:space="preserve">To make the formulation concrete, Table 7 shows the quantities defined above for the most responsive location during the late-September 2024 storm, from the corrected series. The antecedent index uses a recession constant</w:t>
+        <w:t xml:space="preserve">To make the formulation concrete, Table 8 shows the quantities defined above for the most responsive location during the late-September 2024 storm, from the corrected series. The antecedent index uses a recession constant</w:t>
       </w:r>
       <w:r>
         <w:t xml:space="preserve"> </w:t>
@@ -12946,7 +14080,7 @@
           <w:b/>
           <w:bCs/>
         </w:rPr>
-        <w:t xml:space="preserve">Table 7. Khokana during the 2024 storm (corrected discharge).</w:t>
+        <w:t xml:space="preserve">Table 8. Khokana during the 2024 storm (corrected discharge).</w:t>
       </w:r>
       <w:r>
         <w:t xml:space="preserve"> </w:t>
@@ -14521,7 +15655,7 @@
         <w:t xml:space="preserve"> </w:t>
       </w:r>
       <w:r>
-        <w:t xml:space="preserve">m³/s on the training period gives 103 to 479 qualifying pairs at every location of the corrected panel (Table 8), so a per-site constant is identifiable everywhere. The median day-to-day ratios are 0.968–0.997 at nine locations, i.e. storage constants of 31 to 320 days, which describe slowly receding baseflow, and 0.772 at Khokana, i.e. about 4 days, consistent with its flashy response. (In the V2 series, the same filter gave only 3 to 37 pairs at five locations and a degenerate ratio of exactly 1.0 at Devghat, because the plateaued values made the diagnostic uninformative; the correction removes this problem.)</w:t>
+        <w:t xml:space="preserve">m³/s on the training period gives 103 to 479 qualifying pairs at every location of the corrected panel (Table 9), so a per-site constant is identifiable everywhere. The median day-to-day ratios are 0.968–0.997 at nine locations, i.e. storage constants of 31 to 320 days, which describe slowly receding baseflow, and 0.772 at Khokana, i.e. about 4 days, consistent with its flashy response. (In the V2 series, the same filter gave only 3 to 37 pairs at five locations and a degenerate ratio of exactly 1.0 at Devghat, because the plateaued values made the diagnostic uninformative; the correction removes this problem.)</w:t>
       </w:r>
     </w:p>
     <w:p>
@@ -14533,7 +15667,7 @@
           <w:b/>
           <w:bCs/>
         </w:rPr>
-        <w:t xml:space="preserve">Table 8. Recession constants estimated on the training period (corrected discharge).</w:t>
+        <w:t xml:space="preserve">Table 9. Recession constants estimated on the training period (corrected discharge).</w:t>
       </w:r>
       <w:r>
         <w:t xml:space="preserve"> </w:t>
@@ -19189,7 +20323,7 @@
           <w:b/>
           <w:bCs/>
         </w:rPr>
-        <w:t xml:space="preserve">Table 9. Intended model configurations.</w:t>
+        <w:t xml:space="preserve">Table 10. Intended model configurations.</w:t>
       </w:r>
       <w:r>
         <w:t xml:space="preserve"> </w:t>
@@ -22503,7 +23637,7 @@
         <w:t xml:space="preserve"> </w:t>
       </w:r>
       <w:r>
-        <w:t xml:space="preserve">Raw cross-correlations (Table 13) mix response with seasonality and must not be reported as lags. For example, correlations at several sites keep rising up to the maximum lag examined (7 days), which reflects the shared seasonal cycle and not a 7-day response time.</w:t>
+        <w:t xml:space="preserve">Raw cross-correlations (Table 14) mix response with seasonality and must not be reported as lags. For example, correlations at several sites keep rising up to the maximum lag examined (7 days), which reflects the shared seasonal cycle and not a 7-day response time.</w:t>
       </w:r>
     </w:p>
     <w:p>
@@ -24021,7 +25155,7 @@
         <w:t xml:space="preserve"> </w:t>
       </w:r>
       <w:r>
-        <w:t xml:space="preserve">between rainfall in Nepal and peak modelled discharge at the most downstream locations (Chatara on the Saptakoshi and Devghat on the Narayani, which become the Koshi and Gandak systems in India). In the September 2024 event, the peak at these locations followed the precipitation peak by 2 days at both (Table 12). We report this as a</w:t>
+        <w:t xml:space="preserve">between rainfall in Nepal and peak modelled discharge at the most downstream locations (Chatara on the Saptakoshi and Devghat on the Narayani, which become the Koshi and Gandak systems in India). In the September 2024 event, the peak at these locations followed the precipitation peak by 2 days at both (Table 13). We report this as a</w:t>
       </w:r>
       <w:r>
         <w:t xml:space="preserve"> </w:t>
@@ -24064,7 +25198,7 @@
           <w:b/>
           <w:bCs/>
         </w:rPr>
-        <w:t xml:space="preserve">Table 10. Analyses by evidential strength.</w:t>
+        <w:t xml:space="preserve">Table 11. Analyses by evidential strength.</w:t>
       </w:r>
     </w:p>
     <w:tbl>
@@ -24957,7 +26091,7 @@
           <w:b/>
           <w:bCs/>
         </w:rPr>
-        <w:t xml:space="preserve">Table 11. Annual maximum modelled discharge (m³/s), corrected series.</w:t>
+        <w:t xml:space="preserve">Table 12. Annual maximum modelled discharge (m³/s), corrected series.</w:t>
       </w:r>
       <w:r>
         <w:t xml:space="preserve"> </w:t>
@@ -25627,7 +26761,7 @@
           <w:b/>
           <w:bCs/>
         </w:rPr>
-        <w:t xml:space="preserve">Table 12. The 27–29 September 2024 storm (positive control).</w:t>
+        <w:t xml:space="preserve">Table 13. The 27–29 September 2024 storm (positive control).</w:t>
       </w:r>
       <w:r>
         <w:t xml:space="preserve"> </w:t>
@@ -26725,7 +27859,7 @@
           <w:b/>
           <w:bCs/>
         </w:rPr>
-        <w:t xml:space="preserve">Table 13. Correlation between</w:t>
+        <w:t xml:space="preserve">Table 14. Correlation between</w:t>
       </w:r>
       <w:r>
         <w:rPr>
@@ -28066,7 +29200,7 @@
           <w:b/>
           <w:bCs/>
         </w:rPr>
-        <w:t xml:space="preserve">Table 14. Median across the ten locations of NSE (raw</w:t>
+        <w:t xml:space="preserve">Table 15. Median across the ten locations of NSE (raw</w:t>
       </w:r>
       <w:r>
         <w:rPr>
@@ -32992,7 +34126,7 @@
           <w:b/>
           <w:bCs/>
         </w:rPr>
-        <w:t xml:space="preserve">Table 15. Number of locations (of 10) at which a model beats persistence in log-space MSE, and how many of those differences are significant after BH correction.</w:t>
+        <w:t xml:space="preserve">Table 16. Number of locations (of 10) at which a model beats persistence in log-space MSE, and how many of those differences are significant after BH correction.</w:t>
       </w:r>
       <w:r>
         <w:t xml:space="preserve"> </w:t>
@@ -35057,7 +36191,7 @@
         <w:t xml:space="preserve"> </w:t>
       </w:r>
       <w:r>
-        <w:t xml:space="preserve">On the chronological split every model beats persistence at 7–10 of 10 locations (Table 15). The differences are significant at one location at one day for most learned models (three for the ridge model and the learned-adjacency graph), and at between 0 and 5 locations at seven days (the learned-adjacency graph is highest with 5, the ridge model and default boosting 0). The recession-persistence baseline B1 is significantly better than persistence at 8 locations at one day and 6 at three days, although its median scores equal those of persistence; this arises from small, consistent gains at many locations.</w:t>
+        <w:t xml:space="preserve">On the chronological split every model beats persistence at 7–10 of 10 locations (Table 16). The differences are significant at one location at one day for most learned models (three for the ridge model and the learned-adjacency graph), and at between 0 and 5 locations at seven days (the learned-adjacency graph is highest with 5, the ridge model and default boosting 0). The recession-persistence baseline B1 is significantly better than persistence at 8 locations at one day and 6 at three days, although its median scores equal those of persistence; this arises from small, consistent gains at many locations.</w:t>
       </w:r>
     </w:p>
     <w:p>
@@ -35101,7 +36235,7 @@
         <w:t xml:space="preserve"> </w:t>
       </w:r>
       <w:r>
-        <w:t xml:space="preserve">Under LOMO the largest gains over persistence at seven days occur for the 2024 monsoon (boosting log-NSE 0.812 against 0.606) and 2025 (0.745 against 0.591); in 2026 the gain is small (0.833 against 0.802). Under forward chaining (Table 14,</w:t>
+        <w:t xml:space="preserve">Under LOMO the largest gains over persistence at seven days occur for the 2024 monsoon (boosting log-NSE 0.812 against 0.606) and 2025 (0.745 against 0.591); in 2026 the gain is small (0.833 against 0.802). Under forward chaining (Table 15,</w:t>
       </w:r>
       <w:r>
         <w:t xml:space="preserve"> </w:t>
@@ -35147,7 +36281,7 @@
           <w:b/>
           <w:bCs/>
         </w:rPr>
-        <w:t xml:space="preserve">Table 16. Seed variability of the LSTM (median log-NSE across locations, chronological split).</w:t>
+        <w:t xml:space="preserve">Table 17. Seed variability of the LSTM (median log-NSE across locations, chronological split).</w:t>
       </w:r>
     </w:p>
     <w:tbl>
@@ -35449,7 +36583,7 @@
           <w:b/>
           <w:bCs/>
         </w:rPr>
-        <w:t xml:space="preserve">Table 17. Median log-NSE across locations for each held-out monsoon (LOMO for the baselines, ridge and boosting; forward chaining for the sequence models).</w:t>
+        <w:t xml:space="preserve">Table 18. Median log-NSE across locations for each held-out monsoon (LOMO for the baselines, ridge and boosting; forward chaining for the sequence models).</w:t>
       </w:r>
       <w:r>
         <w:t xml:space="preserve"> </w:t>
@@ -37085,7 +38219,7 @@
           <w:b/>
           <w:bCs/>
         </w:rPr>
-        <w:t xml:space="preserve">Table 18. Per-location NSE and log-NSE at</w:t>
+        <w:t xml:space="preserve">Table 19. Per-location NSE and log-NSE at</w:t>
       </w:r>
       <w:r>
         <w:rPr>
@@ -38363,7 +39497,7 @@
           <w:b/>
           <w:bCs/>
         </w:rPr>
-        <w:t xml:space="preserve">Table 19. Per-location NSE and log-NSE at</w:t>
+        <w:t xml:space="preserve">Table 20. Per-location NSE and log-NSE at</w:t>
       </w:r>
       <w:r>
         <w:rPr>
@@ -39694,7 +40828,7 @@
           <w:b/>
           <w:bCs/>
         </w:rPr>
-        <w:t xml:space="preserve">Table 20. Event-based scores, chronological split (threshold = training-period 95th percentile).</w:t>
+        <w:t xml:space="preserve">Table 21. Event-based scores, chronological split (threshold = training-period 95th percentile).</w:t>
       </w:r>
     </w:p>
     <w:tbl>
@@ -41506,7 +42640,7 @@
           <w:b/>
           <w:bCs/>
         </w:rPr>
-        <w:t xml:space="preserve">Table 21. Quantile forecast evaluation (chronological split).</w:t>
+        <w:t xml:space="preserve">Table 22. Quantile forecast evaluation (chronological split).</w:t>
       </w:r>
     </w:p>
     <w:tbl>
@@ -42055,7 +43189,7 @@
           <w:b/>
           <w:bCs/>
         </w:rPr>
-        <w:t xml:space="preserve">Table 22. Paired comparisons of model arms: median difference in site-level log-NSE and the number of locations where the first model is better.</w:t>
+        <w:t xml:space="preserve">Table 23. Paired comparisons of model arms: median difference in site-level log-NSE and the number of locations where the first model is better.</w:t>
       </w:r>
     </w:p>
     <w:tbl>
@@ -44873,7 +46007,7 @@
         <w:pStyle w:val="BodyText"/>
       </w:pPr>
       <w:r>
-        <w:t xml:space="preserve">The event-based scores (Table 20) and Table 15 show the same plateau: all learned models are within a narrow band, each is better than persistence at most locations, and few of the differences are statistically distinguishable from persistence.</w:t>
+        <w:t xml:space="preserve">The event-based scores (Table 21) and Table 16 show the same plateau: all learned models are within a narrow band, each is better than persistence at most locations, and few of the differences are statistically distinguishable from persistence.</w:t>
       </w:r>
     </w:p>
     <w:bookmarkEnd w:id="100"/>
@@ -44919,7 +46053,7 @@
           <w:b/>
           <w:bCs/>
         </w:rPr>
-        <w:t xml:space="preserve">Table 23. LOLO results at</w:t>
+        <w:t xml:space="preserve">Table 24. LOLO results at</w:t>
       </w:r>
       <w:r>
         <w:rPr>
@@ -44954,7 +46088,7 @@
           <w:b/>
           <w:bCs/>
         </w:rPr>
-        <w:t xml:space="preserve">(log-NSE), with the within-site pooled boosted model as the reference and the regime distance of Table 25.</w:t>
+        <w:t xml:space="preserve">(log-NSE), with the within-site pooled boosted model as the reference and the regime distance of Table 26.</w:t>
       </w:r>
     </w:p>
     <w:tbl>
@@ -45938,7 +47072,7 @@
           <w:b/>
           <w:bCs/>
         </w:rPr>
-        <w:t xml:space="preserve">Table 24. LOLO results at</w:t>
+        <w:t xml:space="preserve">Table 25. LOLO results at</w:t>
       </w:r>
       <w:r>
         <w:rPr>
@@ -47058,7 +48192,7 @@
         <w:t xml:space="preserve"> </w:t>
       </w:r>
       <w:r>
-        <w:t xml:space="preserve">and the standard deviation of daily log-increments; Table 25) singles out Khokana (6.19), then Rasuwagadhi (4.02) and Bhada Bridge (3.51); the others lie between 2.3 and 3.2. The rank correlation between regime distance and the LOLO loss is negative in three of four cases and not significant with ten locations (Spearman</w:t>
+        <w:t xml:space="preserve">and the standard deviation of daily log-increments; Table 26) singles out Khokana (6.19), then Rasuwagadhi (4.02) and Bhada Bridge (3.51); the others lie between 2.3 and 3.2. The rank correlation between regime distance and the LOLO loss is negative in three of four cases and not significant with ten locations (Spearman</w:t>
       </w:r>
       <w:r>
         <w:t xml:space="preserve"> </w:t>
@@ -47237,7 +48371,7 @@
           <w:b/>
           <w:bCs/>
         </w:rPr>
-        <w:t xml:space="preserve">Table 25. Regime descriptors used for the distance (training period).</w:t>
+        <w:t xml:space="preserve">Table 26. Regime descriptors used for the distance (training period).</w:t>
       </w:r>
       <w:r>
         <w:t xml:space="preserve"> </w:t>
@@ -48436,7 +49570,7 @@
           <w:b/>
           <w:bCs/>
         </w:rPr>
-        <w:t xml:space="preserve">Table 26. Rank correlation between regime distance and the change in log-NSE under LOLO.</w:t>
+        <w:t xml:space="preserve">Table 27. Rank correlation between regime distance and the change in log-NSE under LOLO.</w:t>
       </w:r>
     </w:p>
     <w:tbl>
@@ -48891,7 +50025,7 @@
           <w:b/>
           <w:bCs/>
         </w:rPr>
-        <w:t xml:space="preserve">Table 27. LOLO over the full period (median across held-out locations).</w:t>
+        <w:t xml:space="preserve">Table 28. LOLO over the full period (median across held-out locations).</w:t>
       </w:r>
     </w:p>
     <w:tbl>
@@ -49210,7 +50344,7 @@
         <w:t xml:space="preserve"> </w:t>
       </w:r>
       <w:r>
-        <w:t xml:space="preserve">After prewhitening (regressing the daily log-increment on the current and ten lagged log-rainfalls, an error-correction term and seasonal harmonics, with a second-difference smoothness penalty chosen by blocked cross-validation), the modelled response is fast everywhere (Table 28, Figure 11). The peak weight falls at lag 1 day at seven locations, at lag 2 days at Belsot and Chameliya/Nayalbadi and at lag 0 at Bhada Bridge. The centroid of the positive weights is shortest at Rasuwagadhi (1.15 days; bootstrap interval 0.97–1.88) and Khokana (1.20; 0.97–1.91), then Chisapani (1.75; 1.62–2.56), Devghat (1.81; 1.49–2.44) and Chatara (2.01; 1.71–2.78), and longest at Chameliya/Nayalbadi (3.33; 2.32–4.05) and Bhada Bridge (3.72; 2.23–4.67). With the corrected series the three large rivers have centroids of 1.8–2.0 days with narrow intervals, whereas the uncorrected tributary cells gave 2.6–2.8 days. The intervals of the slower locations overlap (Belsot 2.50, Bahrabise 2.78, Kusum 2.85, Chameliya/Nayalbadi 3.33), so the data do</w:t>
+        <w:t xml:space="preserve">After prewhitening (regressing the daily log-increment on the current and ten lagged log-rainfalls, an error-correction term and seasonal harmonics, with a second-difference smoothness penalty chosen by blocked cross-validation), the modelled response is fast everywhere (Table 29, Figure 11). The peak weight falls at lag 1 day at seven locations, at lag 2 days at Belsot and Chameliya/Nayalbadi and at lag 0 at Bhada Bridge. The centroid of the positive weights is shortest at Rasuwagadhi (1.15 days; bootstrap interval 0.97–1.88) and Khokana (1.20; 0.97–1.91), then Chisapani (1.75; 1.62–2.56), Devghat (1.81; 1.49–2.44) and Chatara (2.01; 1.71–2.78), and longest at Chameliya/Nayalbadi (3.33; 2.32–4.05) and Bhada Bridge (3.72; 2.23–4.67). With the corrected series the three large rivers have centroids of 1.8–2.0 days with narrow intervals, whereas the uncorrected tributary cells gave 2.6–2.8 days. The intervals of the slower locations overlap (Belsot 2.50, Bahrabise 2.78, Kusum 2.85, Chameliya/Nayalbadi 3.33), so the data do</w:t>
       </w:r>
       <w:r>
         <w:t xml:space="preserve"> </w:t>
@@ -49226,7 +50360,7 @@
         <w:t xml:space="preserve"> </w:t>
       </w:r>
       <w:r>
-        <w:t xml:space="preserve">resolve an ordering among them. The raw correlations of Table 13, which kept rising out to seven days, therefore overstate the response time because of the common seasonal cycle. The cumulative response</w:t>
+        <w:t xml:space="preserve">resolve an ordering among them. The raw correlations of Table 14, which kept rising out to seven days, therefore overstate the response time because of the common seasonal cycle. The cumulative response</w:t>
       </w:r>
       <w:r>
         <w:t xml:space="preserve"> </w:t>
@@ -49281,7 +50415,7 @@
           <w:b/>
           <w:bCs/>
         </w:rPr>
-        <w:t xml:space="preserve">Table 28. Distributed-lag summary (prewhitened).</w:t>
+        <w:t xml:space="preserve">Table 29. Distributed-lag summary (prewhitened).</w:t>
       </w:r>
       <w:r>
         <w:t xml:space="preserve"> </w:t>
@@ -50755,7 +51889,7 @@
         </m:r>
       </m:oMath>
       <w:r>
-        <w:t xml:space="preserve">): for a given event rainfall, a wetter antecedent period is associated with a smaller relative rise, which is the opposite of the wet-catchment amplification hypothesis and may reflect that wet periods have higher baseflow. The forecasting ablation agrees with the null on soil moisture (Table 30): dropping the soil-moisture features from the pooled boosted model under LOMO changes the median log-NSE by 0.000 at</w:t>
+        <w:t xml:space="preserve">): for a given event rainfall, a wetter antecedent period is associated with a smaller relative rise, which is the opposite of the wet-catchment amplification hypothesis and may reflect that wet periods have higher baseflow. The forecasting ablation agrees with the null on soil moisture (Table 31): dropping the soil-moisture features from the pooled boosted model under LOMO changes the median log-NSE by 0.000 at</w:t>
       </w:r>
       <w:r>
         <w:t xml:space="preserve"> </w:t>
@@ -50814,7 +51948,7 @@
         <w:t xml:space="preserve"> </w:t>
       </w:r>
       <w:r>
-        <w:t xml:space="preserve">the three-day score slightly (+0.004). Grouped permutation importance on the chronological test window gives the same ordering (Table 31): flow lags dominate at every horizon (106 %, 99 % and 113 % increase in MSE when permuted), current rain matters at one day (92 %) but not beyond (21 % at three days, 2 % at seven), the temperature, humidity and snow group matters at one and three days (21 % and 11 %), site and elevation at one day (23 %), season at longer horizons (14–15 %), and soil moisture (1.2 %, −2.0 %, −1.6 %) is indistinguishable from zero. TreeSHAP on a LightGBM model with the same features (Table 32) gives a similar ordering: flow lags 42 %, 38 % and 42 % of the mean absolute SHAP value at 1, 3 and 7 days, current rain 26 %, 21 % and 9 %, season 9 %, 17 % and 24 %, temperature, humidity and snow 11 %, 12 % and 8 %. It assigns soil moisture a small but non-zero share (3.3–3.6 %) and site and elevation only 4 %, against 23 % at one day (and 2–5 % at longer horizons) in the permutation importance. The two measures differ in what they ask: SHAP measures how much a feature moves the model’s output, permutation importance how much predictive accuracy depends on it, so a feature can move the output (here soil moisture, a little) without improving accuracy. These results do not show that soil moisture is unimportant in real catchments; they show that, in this</w:t>
+        <w:t xml:space="preserve">the three-day score slightly (+0.004). Grouped permutation importance on the chronological test window gives the same ordering (Table 32): flow lags dominate at every horizon (106 %, 99 % and 113 % increase in MSE when permuted), current rain matters at one day (92 %) but not beyond (21 % at three days, 2 % at seven), the temperature, humidity and snow group matters at one and three days (21 % and 11 %), site and elevation at one day (23 %), season at longer horizons (14–15 %), and soil moisture (1.2 %, −2.0 %, −1.6 %) is indistinguishable from zero. TreeSHAP on a LightGBM model with the same features (Table 33) gives a similar ordering: flow lags 42 %, 38 % and 42 % of the mean absolute SHAP value at 1, 3 and 7 days, current rain 26 %, 21 % and 9 %, season 9 %, 17 % and 24 %, temperature, humidity and snow 11 %, 12 % and 8 %. It assigns soil moisture a small but non-zero share (3.3–3.6 %) and site and elevation only 4 %, against 23 % at one day (and 2–5 % at longer horizons) in the permutation importance. The two measures differ in what they ask: SHAP measures how much a feature moves the model’s output, permutation importance how much predictive accuracy depends on it, so a feature can move the output (here soil moisture, a little) without improving accuracy. These results do not show that soil moisture is unimportant in real catchments; they show that, in this</w:t>
       </w:r>
       <w:r>
         <w:t xml:space="preserve"> </w:t>
@@ -50842,7 +51976,7 @@
           <w:b/>
           <w:bCs/>
         </w:rPr>
-        <w:t xml:space="preserve">Table 29. Mixed-effects model of event amplification.</w:t>
+        <w:t xml:space="preserve">Table 30. Mixed-effects model of event amplification.</w:t>
       </w:r>
     </w:p>
     <w:tbl>
@@ -51323,7 +52457,7 @@
           <w:b/>
           <w:bCs/>
         </w:rPr>
-        <w:t xml:space="preserve">Table 30. Feature-group ablation, LOMO, pooled boosted model (median across locations).</w:t>
+        <w:t xml:space="preserve">Table 31. Feature-group ablation, LOMO, pooled boosted model (median across locations).</w:t>
       </w:r>
     </w:p>
     <w:tbl>
@@ -52066,7 +53200,7 @@
           <w:b/>
           <w:bCs/>
         </w:rPr>
-        <w:t xml:space="preserve">Table 31. Grouped permutation importance (percentage increase in test MSE of the increment when the group is permuted within the test window).</w:t>
+        <w:t xml:space="preserve">Table 32. Grouped permutation importance (percentage increase in test MSE of the increment when the group is permuted within the test window).</w:t>
       </w:r>
     </w:p>
     <w:tbl>
@@ -52463,7 +53597,7 @@
           <w:b/>
           <w:bCs/>
         </w:rPr>
-        <w:t xml:space="preserve">Table 32. Grouped TreeSHAP importance of a LightGBM model with the same features (share of the mean absolute SHAP value, chronological test window).</w:t>
+        <w:t xml:space="preserve">Table 33. Grouped TreeSHAP importance of a LightGBM model with the same features (share of the mean absolute SHAP value, chronological test window).</w:t>
       </w:r>
     </w:p>
     <w:tbl>
@@ -53008,7 +54142,7 @@
         <w:t xml:space="preserve">every 95 % bootstrap interval contains zero</w:t>
       </w:r>
       <w:r>
-        <w:t xml:space="preserve">, with 30–43 peaks per location (Table 33; precipitation is unaffected by the discharge correction). Profile-likelihood intervals, which are better behaved than the bootstrap for samples this small, are narrower and exclude zero at four locations (Bhada Bridge 0.13 to 1.10, Belsot 0.10 to 1.03, Khokana 0.01 to 1.09 and Chisapani 0.06 to 0.71; Table 35), so the evidence for a heavy precipitation tail depends on the interval method and is suggestive at those four locations only. The September 2024 daily maximum is above the fitted threshold at nine of ten locations (Chameliya/Nayalbadi is the exception, 10.4 mm). The implied return period of that maximum under the tail fitted</w:t>
+        <w:t xml:space="preserve">, with 30–43 peaks per location (Table 34; precipitation is unaffected by the discharge correction). Profile-likelihood intervals, which are better behaved than the bootstrap for samples this small, are narrower and exclude zero at four locations (Bhada Bridge 0.13 to 1.10, Belsot 0.10 to 1.03, Khokana 0.01 to 1.09 and Chisapani 0.06 to 0.71; Table 36), so the evidence for a heavy precipitation tail depends on the interval method and is suggestive at those four locations only. The September 2024 daily maximum is above the fitted threshold at nine of ten locations (Chameliya/Nayalbadi is the exception, 10.4 mm). The implied return period of that maximum under the tail fitted</w:t>
       </w:r>
       <w:r>
         <w:t xml:space="preserve"> </w:t>
@@ -53068,7 +54202,7 @@
         </m:r>
       </m:oMath>
       <w:r>
-        <w:t xml:space="preserve">, makes a 140 mm day extreme), so we read them only as a consistency check that identifies Devghat, Rasuwagadhi and Bahrabise as the locations where the storm was most unusual relative to the rest of the record. For normalised corrected discharge (Table 34) only 8–28 declustered peaks are available per location, Belsot and Rasuwagadhi have too few to fit, every bootstrap shape interval contains zero (for example −2.33 to 0.73 at Chatara), while profile-likelihood intervals reach the edge of the ±1.5 search range at six of the eight locations (uninformative) and exclude zero only at Chatara (−1.50 to −0.11) and Chameliya/Nayalbadi (−1.50 to −1.09), both negative and so bounded tails, and the implied return periods of the September 2024 peak range from 2.5 years (Bahrabise) and 6.9 years (Devghat, Khokana) to about 100 years (Bhada Bridge, Kusum). At Chatara the peak exceeds the finite upper end of the fitted bounded tail, and at Chameliya/Nayalbadi and Chisapani it is below the threshold, so no return period applies. We do not report design return levels.</w:t>
+        <w:t xml:space="preserve">, makes a 140 mm day extreme), so we read them only as a consistency check that identifies Devghat, Rasuwagadhi and Bahrabise as the locations where the storm was most unusual relative to the rest of the record. For normalised corrected discharge (Table 35) only 8–28 declustered peaks are available per location, Belsot and Rasuwagadhi have too few to fit, every bootstrap shape interval contains zero (for example −2.33 to 0.73 at Chatara), while profile-likelihood intervals reach the edge of the ±1.5 search range at six of the eight locations (uninformative) and exclude zero only at Chatara (−1.50 to −0.11) and Chameliya/Nayalbadi (−1.50 to −1.09), both negative and so bounded tails, and the implied return periods of the September 2024 peak range from 2.5 years (Bahrabise) and 6.9 years (Devghat, Khokana) to about 100 years (Bhada Bridge, Kusum). At Chatara the peak exceeds the finite upper end of the fitted bounded tail, and at Chameliya/Nayalbadi and Chisapani it is below the threshold, so no return period applies. We do not report design return levels.</w:t>
       </w:r>
     </w:p>
     <w:p>
@@ -53080,7 +54214,7 @@
           <w:b/>
           <w:bCs/>
         </w:rPr>
-        <w:t xml:space="preserve">Table 33. GPD fits for daily precipitation (event window excluded), 95 % bootstrap intervals for</w:t>
+        <w:t xml:space="preserve">Table 34. GPD fits for daily precipitation (event window excluded), 95 % bootstrap intervals for</w:t>
       </w:r>
       <w:r>
         <w:rPr>
@@ -54122,7 +55256,7 @@
           <w:b/>
           <w:bCs/>
         </w:rPr>
-        <w:t xml:space="preserve">Table 34. GPD fits for discharge normalised by the location median (corrected series).</w:t>
+        <w:t xml:space="preserve">Table 35. GPD fits for discharge normalised by the location median (corrected series).</w:t>
       </w:r>
     </w:p>
     <w:tbl>
@@ -54965,7 +56099,7 @@
           <w:b/>
           <w:bCs/>
         </w:rPr>
-        <w:t xml:space="preserve">Table 35. Profile-likelihood 95 % intervals for the GPD shape, compared with the bootstrap intervals (event window excluded).</w:t>
+        <w:t xml:space="preserve">Table 36. Profile-likelihood 95 % intervals for the GPD shape, compared with the bootstrap intervals (event window excluded).</w:t>
       </w:r>
       <w:r>
         <w:t xml:space="preserve"> </w:t>
@@ -57122,7 +58256,7 @@
           <w:b/>
           <w:bCs/>
         </w:rPr>
-        <w:t xml:space="preserve">Table 36. Joint-extreme summary (corrected series).</w:t>
+        <w:t xml:space="preserve">Table 37. Joint-extreme summary (corrected series).</w:t>
       </w:r>
     </w:p>
     <w:tbl>
@@ -57505,7 +58639,7 @@
         <w:t xml:space="preserve"> </w:t>
       </w:r>
       <w:r>
-        <w:t xml:space="preserve">After removing the local rainfall response and the autoregressive term from each series, the residual cross-correlations between an upstream and a downstream location are clearly above those of control pairs (Table 37): 0.52 at lag 0 for Rasuwagadhi → Devghat (bootstrap interval 0.42–0.62; 0.30 at lag 1) and 0.52 for Bahrabise → Chatara (0.35–0.65; 0.14 at lag 1), against 0.12 (Rasuwagadhi → Kusum) and 0.11 (Bahrabise → Chisapani; 0.17 at lag 1) for pairs from different basins. The best lag is zero for the two upstream–downstream pairs.</w:t>
+        <w:t xml:space="preserve">After removing the local rainfall response and the autoregressive term from each series, the residual cross-correlations between an upstream and a downstream location are clearly above those of control pairs (Table 38): 0.52 at lag 0 for Rasuwagadhi → Devghat (bootstrap interval 0.42–0.62; 0.30 at lag 1) and 0.52 for Bahrabise → Chatara (0.35–0.65; 0.14 at lag 1), against 0.12 (Rasuwagadhi → Kusum) and 0.11 (Bahrabise → Chisapani; 0.17 at lag 1) for pairs from different basins. The best lag is zero for the two upstream–downstream pairs.</w:t>
       </w:r>
       <w:r>
         <w:t xml:space="preserve"> </w:t>
@@ -57530,7 +58664,7 @@
           <w:b/>
           <w:bCs/>
         </w:rPr>
-        <w:t xml:space="preserve">Table 37. Residual cross-correlation (upstream at time</w:t>
+        <w:t xml:space="preserve">Table 38. Residual cross-correlation (upstream at time</w:t>
       </w:r>
       <w:r>
         <w:rPr>
@@ -58241,7 +59375,7 @@
         <w:t xml:space="preserve"> </w:t>
       </w:r>
       <w:r>
-        <w:t xml:space="preserve">Table 8 gives the training-period master-recession constants of the corrected series; the recession-persistence baseline B1 is close to persistence (identical medians at one day), and its significant advantage at eight locations at one day under the chronological split (Table 15) arises from small gains at many locations.</w:t>
+        <w:t xml:space="preserve">Table 9 gives the training-period master-recession constants of the corrected series; the recession-persistence baseline B1 is close to persistence (identical medians at one day), and its significant advantage at eight locations at one day under the chronological split (Table 16) arises from small gains at many locations.</w:t>
       </w:r>
     </w:p>
     <w:bookmarkEnd w:id="114"/>
@@ -58277,7 +59411,7 @@
         <w:t xml:space="preserve"> </w:t>
       </w:r>
       <w:r>
-        <w:t xml:space="preserve">We computed standardised one-day-ahead forecast residuals out of fold (LOMO, monsoon months only, per-location standardisation) and ranked the residual in a ±1-day window around each event (Table 38). The rain-driven storm produces some of the largest residuals in the record (standardised residual 3.8–4.2 for Kusum, 2.4–3.3 for Khokana and 6.1–6.9 for Devghat, at or above the 98.0th percentile of the monsoon out-of-fold residuals), while the three non-rainfall events give residuals within the ordinary range: 0.08 and −0.34 at Chatara (percentiles 59 and 30), −0.43 and 0.29 at Bahrabise (23 and 80), and 1.00 and 0.81 at Rasuwagadhi (88 and 85).</w:t>
+        <w:t xml:space="preserve">We computed standardised one-day-ahead forecast residuals out of fold (LOMO, monsoon months only, per-location standardisation) and ranked the residual in a ±1-day window around each event (Table 39). The rain-driven storm produces some of the largest residuals in the record (standardised residual 3.8–4.2 for Kusum, 2.4–3.3 for Khokana and 6.1–6.9 for Devghat, at or above the 98.0th percentile of the monsoon out-of-fold residuals), while the three non-rainfall events give residuals within the ordinary range: 0.08 and −0.34 at Chatara (percentiles 59 and 30), −0.43 and 0.29 at Bahrabise (23 and 80), and 1.00 and 0.81 at Rasuwagadhi (88 and 85).</w:t>
       </w:r>
     </w:p>
     <w:p>
@@ -58295,7 +59429,7 @@
         <w:t xml:space="preserve"> </w:t>
       </w:r>
       <w:r>
-        <w:t xml:space="preserve">An isolation forest fitted per location on six standardised features of the rainfall–discharge relationship (log-increment, current and lagged rain, 3-day rain, soil-moisture anomaly, discharge anomaly), with no event labels, places the three storm days at the 99.93rd percentile of each location’s record and the three non-rainfall events at ordinary levels (Chatara 64.9, Bahrabise 73.8, Rasuwagadhi 67.7; Table 39).</w:t>
+        <w:t xml:space="preserve">An isolation forest fitted per location on six standardised features of the rainfall–discharge relationship (log-increment, current and lagged rain, 3-day rain, soil-moisture anomaly, discharge anomaly), with no event labels, places the three storm days at the 99.93rd percentile of each location’s record and the three non-rainfall events at ordinary levels (Chatara 64.9, Bahrabise 73.8, Rasuwagadhi 67.7; Table 40).</w:t>
       </w:r>
     </w:p>
     <w:p>
@@ -58329,7 +59463,7 @@
         <w:t xml:space="preserve">absent from the modelled data</w:t>
       </w:r>
       <w:r>
-        <w:t xml:space="preserve">, not merely missed by the model, which supports the conclusion that whatever caused those floods is not in the panel. A third detector, an LSTM autoencoder trained without labels on all windows (Table 40), agrees: it places the three storm days at the 99.3rd–99.9th percentile of each location’s reconstruction error, and the three non-rainfall events at the 81st (Rasuwagadhi), 85th (Bahrabise) and 87th (Chatara) percentiles, higher than the isolation forest gave but below any usual alarm level.</w:t>
+        <w:t xml:space="preserve">, not merely missed by the model, which supports the conclusion that whatever caused those floods is not in the panel. A third detector, an LSTM autoencoder trained without labels on all windows (Table 41), agrees: it places the three storm days at the 99.3rd–99.9th percentile of each location’s reconstruction error, and the three non-rainfall events at the 81st (Rasuwagadhi), 85th (Bahrabise) and 87th (Chatara) percentiles, higher than the isolation forest gave but below any usual alarm level.</w:t>
       </w:r>
     </w:p>
     <w:p>
@@ -58341,7 +59475,7 @@
           <w:b/>
           <w:bCs/>
         </w:rPr>
-        <w:t xml:space="preserve">Table 38. Out-of-fold standardised residuals around documented events (</w:t>
+        <w:t xml:space="preserve">Table 39. Out-of-fold standardised residuals around documented events (</w:t>
       </w:r>
       <m:oMath>
         <m:r>
@@ -59421,7 +60555,7 @@
           <w:b/>
           <w:bCs/>
         </w:rPr>
-        <w:t xml:space="preserve">Table 39. Isolation-forest percentile of the documented events (maximum over ±1 day).</w:t>
+        <w:t xml:space="preserve">Table 40. Isolation-forest percentile of the documented events (maximum over ±1 day).</w:t>
       </w:r>
     </w:p>
     <w:tbl>
@@ -59872,7 +61006,7 @@
         <w:t xml:space="preserve"> </w:t>
       </w:r>
       <w:r>
-        <w:t xml:space="preserve">the 2024 monsoon and perturbed its inputs at the origins 26 and 27 September 2024: soil-moisture anomaly ±1 standard deviation and rainfall features scaled by 0.8 and 1.2. The model is almost insensitive to these changes (Table 41): the soil-moisture perturbations change the predicted next-day discharge by exactly 0.0 % at the 27 September origin at all four locations, and the rainfall scalings by between −11.4 % and +4.5 %, with a non-monotone response at Khokana (more rain, lower prediction). The model also cannot reproduce the storm: from the 27 September origin it predicts 470 m³/s at Khokana against an observed 1,632 and 764 m³/s at Kusum against 3,176 (about 71–76 % too low), and 4,320 and 5,108 m³/s at Devghat and Chatara against 6,280 and 7,515 (about 30 % too low). Tree ensembles cannot extrapolate beyond the target range seen in training, and the storm exceeds it.</w:t>
+        <w:t xml:space="preserve">the 2024 monsoon and perturbed its inputs at the origins 26 and 27 September 2024: soil-moisture anomaly ±1 standard deviation and rainfall features scaled by 0.8 and 1.2. The model is almost insensitive to these changes (Table 42): the soil-moisture perturbations change the predicted next-day discharge by exactly 0.0 % at the 27 September origin at all four locations, and the rainfall scalings by between −11.4 % and +4.5 %, with a non-monotone response at Khokana (more rain, lower prediction). The model also cannot reproduce the storm: from the 27 September origin it predicts 470 m³/s at Khokana against an observed 1,632 and 764 m³/s at Kusum against 3,176 (about 71–76 % too low), and 4,320 and 5,108 m³/s at Devghat and Chatara against 6,280 and 7,515 (about 30 % too low). Tree ensembles cannot extrapolate beyond the target range seen in training, and the storm exceeds it.</w:t>
       </w:r>
       <w:r>
         <w:t xml:space="preserve"> </w:t>
@@ -59894,7 +61028,7 @@
           <w:b/>
           <w:bCs/>
         </w:rPr>
-        <w:t xml:space="preserve">Table 40. LSTM-autoencoder percentile of the documented events (reconstruction error of the last three days of the 30-day window, maximum over ±1 day).</w:t>
+        <w:t xml:space="preserve">Table 41. LSTM-autoencoder percentile of the documented events (reconstruction error of the last three days of the 30-day window, maximum over ±1 day).</w:t>
       </w:r>
     </w:p>
     <w:tbl>
@@ -60323,7 +61457,7 @@
           <w:b/>
           <w:bCs/>
         </w:rPr>
-        <w:t xml:space="preserve">Table 41. Counterfactual perturbations, boosted model trained without the 2024 monsoon (origins 26 and 27 September 2024,</w:t>
+        <w:t xml:space="preserve">Table 42. Counterfactual perturbations, boosted model trained without the 2024 monsoon (origins 26 and 27 September 2024,</w:t>
       </w:r>
       <w:r>
         <w:rPr>
@@ -63753,7 +64887,7 @@
         <w:pStyle w:val="FirstParagraph"/>
       </w:pPr>
       <w:r>
-        <w:t xml:space="preserve">Table 42 compares key results on the uncorrected V2 series (the companion document</w:t>
+        <w:t xml:space="preserve">Table 43 compares key results on the uncorrected V2 series (the companion document</w:t>
       </w:r>
       <w:r>
         <w:t xml:space="preserve"> </w:t>
@@ -63777,7 +64911,7 @@
           <w:b/>
           <w:bCs/>
         </w:rPr>
-        <w:t xml:space="preserve">Table 42. Key results before and after correcting the discharge cells.</w:t>
+        <w:t xml:space="preserve">Table 43. Key results before and after correcting the discharge cells.</w:t>
       </w:r>
     </w:p>
     <w:tbl>
@@ -64913,7 +66047,7 @@
         <w:t xml:space="preserve"> </w:t>
       </w:r>
       <w:r>
-        <w:t xml:space="preserve">The cell error was not a cosmetic problem. It produced a quantised and intermittent target for several locations, understated the magnitude of the large rivers by three orders of magnitude, hid an upstream–downstream coupling that is clearly present once the channel is sampled, and distorted the interval calibration at high flows. A benchmark built on the uncorrected file would have given numbers that are internally consistent and scientifically misleading. The correction is a heuristic (Section 3.4), but it moves the panel from clearly wrong to plausible, and the comparison of Table 42 shows which conclusions survive.</w:t>
+        <w:t xml:space="preserve">The cell error was not a cosmetic problem. It produced a quantised and intermittent target for several locations, understated the magnitude of the large rivers by three orders of magnitude, hid an upstream–downstream coupling that is clearly present once the channel is sampled, and distorted the interval calibration at high flows. A benchmark built on the uncorrected file would have given numbers that are internally consistent and scientifically misleading. The correction is a heuristic (Section 3.4), but it moves the panel from clearly wrong to plausible, and the comparison of Table 43 shows which conclusions survive.</w:t>
       </w:r>
     </w:p>
     <w:p>
@@ -64943,7 +66077,7 @@
         <w:t xml:space="preserve"> </w:t>
       </w:r>
       <w:r>
-        <w:t xml:space="preserve">can reach a high accuracy by predicting the previous day’s label, because high-flow days cluster in the monsoon, and accuracy is dominated by the majority class. The comparison that matters is with the persistence classifier, with precision–recall and event-level measures (Table 20), and under all three label definitions of Section 4.7. In our test window persistence already detects every event at one day (event POD 1.00) with a false-alarm ratio of 0.20.</w:t>
+        <w:t xml:space="preserve">can reach a high accuracy by predicting the previous day’s label, because high-flow days cluster in the monsoon, and accuracy is dominated by the majority class. The comparison that matters is with the persistence classifier, with precision–recall and event-level measures (Table 21), and under all three label definitions of Section 4.7. In our test window persistence already detects every event at one day (event POD 1.00) with a false-alarm ratio of 0.20.</w:t>
       </w:r>
     </w:p>
     <w:p>
@@ -65036,7 +66170,7 @@
         <w:t xml:space="preserve"> </w:t>
       </w:r>
       <w:r>
-        <w:t xml:space="preserve">rule could in principle select a different river near a confluence; and weather and soil moisture are still taken at the original coordinate, up to about 0.11° from the discharge cell. Until the corrected cells are checked against DHM gauge series, we interpret results as properties of the corrected</w:t>
+        <w:t xml:space="preserve">rule could in principle select a different river near a confluence; and weather and soil moisture are still taken at the original coordinate, up to about 0.11° from the discharge cell. The only checks available were internal (Section 3.4: the catchment area implied by the mean flow, and the nesting of upstream and downstream flows), which support the three large-river corrections and flag Khokana and Rasuwagadhi as uncertain. Until the corrected cells are checked against DHM gauge series, we interpret results as properties of the corrected</w:t>
       </w:r>
       <w:r>
         <w:t xml:space="preserve"> </w:t>
@@ -65210,7 +66344,7 @@
           <w:b/>
           <w:bCs/>
         </w:rPr>
-        <w:t xml:space="preserve">Table 43. What was implemented and run, and what remains.</w:t>
+        <w:t xml:space="preserve">Table 44. What was implemented and run, and what remains.</w:t>
       </w:r>
     </w:p>
     <w:tbl>
@@ -66291,7 +67425,7 @@
         </w:numPr>
       </w:pPr>
       <w:r>
-        <w:t xml:space="preserve">Run the remaining unrun items of Table 43 (wavelet coherence and the reference Temporal Fusion Transformer). After any re-run, execute</w:t>
+        <w:t xml:space="preserve">Run the remaining unrun items of Table 44 (wavelet coherence and the reference Temporal Fusion Transformer). After any re-run, execute</w:t>
       </w:r>
       <w:r>
         <w:t xml:space="preserve"> </w:t>

</xml_diff>